<commit_message>
Publish updated PDF resume
</commit_message>
<xml_diff>
--- a/downloads/Daisy_Wangondu_Resume.docx
+++ b/downloads/Daisy_Wangondu_Resume.docx
@@ -1,6 +1,6 @@
 
 <file path=word/document.xml><?xml version="1.0" encoding="utf-8"?>
-<w:document xmlns:wpc="http://schemas.microsoft.com/office/word/2010/wordprocessingCanvas" xmlns:mc="http://schemas.openxmlformats.org/markup-compatibility/2006" xmlns:o="urn:schemas-microsoft-com:office:office" xmlns:r="http://schemas.openxmlformats.org/officeDocument/2006/relationships" xmlns:m="http://schemas.openxmlformats.org/officeDocument/2006/math" xmlns:v="urn:schemas-microsoft-com:vml" xmlns:wp14="http://schemas.microsoft.com/office/word/2010/wordprocessingDrawing" xmlns:wp="http://schemas.openxmlformats.org/drawingml/2006/wordprocessingDrawing" xmlns:w10="urn:schemas-microsoft-com:office:word" xmlns:w="http://schemas.openxmlformats.org/wordprocessingml/2006/main" xmlns:w14="http://schemas.microsoft.com/office/word/2010/wordml" xmlns:w15="http://schemas.microsoft.com/office/word/2012/wordml" xmlns:wpg="http://schemas.microsoft.com/office/word/2010/wordprocessingGroup" xmlns:wpi="http://schemas.microsoft.com/office/word/2010/wordprocessingInk" xmlns:wne="http://schemas.microsoft.com/office/word/2006/wordml" xmlns:wps="http://schemas.microsoft.com/office/word/2010/wordprocessingShape" xmlns:cx="http://schemas.microsoft.com/office/drawing/2014/chartex" xmlns:cx1="http://schemas.microsoft.com/office/drawing/2015/9/8/chartex" xmlns:cx2="http://schemas.microsoft.com/office/drawing/2015/10/21/chartex" xmlns:cx3="http://schemas.microsoft.com/office/drawing/2016/5/9/chartex" xmlns:cx4="http://schemas.microsoft.com/office/drawing/2016/5/10/chartex" xmlns:cx5="http://schemas.microsoft.com/office/drawing/2016/5/11/chartex" xmlns:cx6="http://schemas.microsoft.com/office/drawing/2016/5/12/chartex" xmlns:cx7="http://schemas.microsoft.com/office/drawing/2016/5/13/chartex" xmlns:cx8="http://schemas.microsoft.com/office/drawing/2016/5/14/chartex" xmlns:aink="http://schemas.microsoft.com/office/drawing/2016/ink" xmlns:am3d="http://schemas.microsoft.com/office/drawing/2017/model3d" xmlns:w16cex="http://schemas.microsoft.com/office/word/2018/wordml/cex" xmlns:w16cid="http://schemas.microsoft.com/office/word/2016/wordml/cid" xmlns:w16="http://schemas.microsoft.com/office/word/2018/wordml" xmlns:w16sdtdh="http://schemas.microsoft.com/office/word/2020/wordml/sdtdatahash" xmlns:w16se="http://schemas.microsoft.com/office/word/2015/wordml/symex" mc:Ignorable="w14 w15 wp14">
+<w:document xmlns:wpc="http://schemas.microsoft.com/office/word/2010/wordprocessingCanvas" xmlns:cx="http://schemas.microsoft.com/office/drawing/2014/chartex" xmlns:cx1="http://schemas.microsoft.com/office/drawing/2015/9/8/chartex" xmlns:cx2="http://schemas.microsoft.com/office/drawing/2015/10/21/chartex" xmlns:mc="http://schemas.openxmlformats.org/markup-compatibility/2006" xmlns:o="urn:schemas-microsoft-com:office:office" xmlns:r="http://schemas.openxmlformats.org/officeDocument/2006/relationships" xmlns:m="http://schemas.openxmlformats.org/officeDocument/2006/math" xmlns:v="urn:schemas-microsoft-com:vml" xmlns:wp14="http://schemas.microsoft.com/office/word/2010/wordprocessingDrawing" xmlns:wp="http://schemas.openxmlformats.org/drawingml/2006/wordprocessingDrawing" xmlns:w10="urn:schemas-microsoft-com:office:word" xmlns:w="http://schemas.openxmlformats.org/wordprocessingml/2006/main" xmlns:w14="http://schemas.microsoft.com/office/word/2010/wordml" xmlns:w15="http://schemas.microsoft.com/office/word/2012/wordml" xmlns:w16se="http://schemas.microsoft.com/office/word/2015/wordml/symex" xmlns:wpg="http://schemas.microsoft.com/office/word/2010/wordprocessingGroup" xmlns:wpi="http://schemas.microsoft.com/office/word/2010/wordprocessingInk" xmlns:wne="http://schemas.microsoft.com/office/word/2006/wordml" xmlns:wps="http://schemas.microsoft.com/office/word/2010/wordprocessingShape" mc:Ignorable="w14 w15 w16se wp14">
   <w:body>
     <w:p>
       <w:pPr>
@@ -9,14 +9,13 @@
       </w:pPr>
       <w:r>
         <w:rPr>
-          <w:rFonts w:ascii="Calibri" w:cs="Calibri" w:eastAsia="Calibri" w:hAnsi="Calibri"/>
           <w:b/>
           <w:bCs/>
-          <w:color w:val="1a365d"/>
+          <w:color w:val="1A365D"/>
           <w:sz w:val="40"/>
           <w:szCs w:val="40"/>
         </w:rPr>
-        <w:t xml:space="preserve">DAISY NYOKABI WANG'ONDU</w:t>
+        <w:t>DAISY NYOKABI WANG'ONDU</w:t>
       </w:r>
     </w:p>
     <w:p>
@@ -26,12 +25,9 @@
       </w:pPr>
       <w:r>
         <w:rPr>
-          <w:rFonts w:ascii="Calibri" w:cs="Calibri" w:eastAsia="Calibri" w:hAnsi="Calibri"/>
-          <w:color w:val="2b6cb0"/>
-          <w:sz w:val="20"/>
-          <w:szCs w:val="20"/>
-        </w:rPr>
-        <w:t xml:space="preserve">Content Marketer  |  Content Strategist  |  Social Media Manager</w:t>
+          <w:color w:val="2B6CB0"/>
+        </w:rPr>
+        <w:t>Content Marketer  |  Content Strategist  |  Social Media Manager</w:t>
       </w:r>
     </w:p>
     <w:p>
@@ -41,55 +37,38 @@
       </w:pPr>
       <w:r>
         <w:rPr>
-          <w:color w:val="4a5568"/>
+          <w:color w:val="4A5568"/>
           <w:sz w:val="18"/>
           <w:szCs w:val="18"/>
         </w:rPr>
-        <w:t xml:space="preserve">Meru, Kenya  •  </w:t>
-      </w:r>
-      <w:r>
-        <w:rPr>
-          <w:color w:val="4a5568"/>
+        <w:t>Meru, Kenya  •  0706 285 433  •  daisywangondu@gmail.com  •  LinkedIn: linkedin.com/in/</w:t>
+      </w:r>
+      <w:proofErr w:type="spellStart"/>
+      <w:r>
+        <w:rPr>
+          <w:color w:val="4A5568"/>
           <w:sz w:val="18"/>
           <w:szCs w:val="18"/>
         </w:rPr>
-        <w:t xml:space="preserve">0706 285 433  •  </w:t>
-      </w:r>
-      <w:r>
-        <w:rPr>
-          <w:color w:val="4a5568"/>
-          <w:sz w:val="18"/>
-          <w:szCs w:val="18"/>
-        </w:rPr>
-        <w:t xml:space="preserve">daisywangondu@gmail.com  •  </w:t>
-      </w:r>
-      <w:r>
-        <w:rPr>
-          <w:color w:val="4a5568"/>
-          <w:sz w:val="18"/>
-          <w:szCs w:val="18"/>
-        </w:rPr>
-        <w:t xml:space="preserve">LinkedIn: linkedin.com/in/daisywangondu</w:t>
-      </w:r>
+        <w:t>daisywangondu</w:t>
+      </w:r>
+      <w:proofErr w:type="spellEnd"/>
     </w:p>
     <w:p>
       <w:pPr>
         <w:pBdr>
-          <w:bottom w:val="single" w:color="2b6cb0" w:sz="8" w:space="4"/>
+          <w:bottom w:val="single" w:sz="8" w:space="4" w:color="2B6CB0"/>
         </w:pBdr>
-        <w:spacing w:after="60" w:before="80"/>
-      </w:pPr>
-      <w:r>
-        <w:rPr>
-          <w:rFonts w:ascii="Calibri" w:cs="Calibri" w:eastAsia="Calibri" w:hAnsi="Calibri"/>
+        <w:spacing w:before="80" w:after="60"/>
+      </w:pPr>
+      <w:r>
+        <w:rPr>
           <w:b/>
           <w:bCs/>
           <w:caps/>
-          <w:color w:val="1a365d"/>
-          <w:sz w:val="20"/>
-          <w:szCs w:val="20"/>
-        </w:rPr>
-        <w:t xml:space="preserve">PROFESSIONAL SUMMARY</w:t>
+          <w:color w:val="1A365D"/>
+        </w:rPr>
+        <w:t>PROFESSIONAL SUMMARY</w:t>
       </w:r>
     </w:p>
     <w:p>
@@ -98,31 +77,73 @@
       </w:pPr>
       <w:r>
         <w:rPr>
-          <w:rFonts w:ascii="Calibri" w:cs="Calibri" w:eastAsia="Calibri" w:hAnsi="Calibri"/>
           <w:sz w:val="18"/>
           <w:szCs w:val="18"/>
         </w:rPr>
-        <w:t xml:space="preserve">Results-driven Content Marketer and Digital Content Professional with over 7 years of experience helping brands grow through content strategy, social media management, community building and creative production. Proven ability to plan and execute multi-platform content (Instagram, Facebook, TikTok, Pinterest), craft compelling brand stories, and manage engaged online communities. Combines strategic thinking with hands-on creative skills in graphic design, short-form video editing and day-to-day digital marketing execution. Experienced across digital marketing agencies, retail, real estate and community organisations.</w:t>
+        <w:t>Results-driven Content Marketer and Digital Content Professional with over 7 years of experience helping brands grow through content strategy, social media management, community building and creative production. Proven ability to plan and execute multi-pla</w:t>
+      </w:r>
+      <w:r>
+        <w:rPr>
+          <w:sz w:val="18"/>
+          <w:szCs w:val="18"/>
+        </w:rPr>
+        <w:t xml:space="preserve">tform content (Instagram, Facebook, </w:t>
+      </w:r>
+      <w:proofErr w:type="spellStart"/>
+      <w:r>
+        <w:rPr>
+          <w:sz w:val="18"/>
+          <w:szCs w:val="18"/>
+        </w:rPr>
+        <w:t>TikTok</w:t>
+      </w:r>
+      <w:proofErr w:type="spellEnd"/>
+      <w:r>
+        <w:rPr>
+          <w:sz w:val="18"/>
+          <w:szCs w:val="18"/>
+        </w:rPr>
+        <w:t>, Pinterest), craft compelling brand stories, and manage engaged online communities. Combines strategic thinking with hands-on creative skills in graphic design, short-form video editing and day-to-day digital mark</w:t>
+      </w:r>
+      <w:r>
+        <w:rPr>
+          <w:sz w:val="18"/>
+          <w:szCs w:val="18"/>
+        </w:rPr>
+        <w:t xml:space="preserve">eting execution. Experienced across digital marketing agencies, retail, real estate and community </w:t>
+      </w:r>
+      <w:proofErr w:type="spellStart"/>
+      <w:r>
+        <w:rPr>
+          <w:sz w:val="18"/>
+          <w:szCs w:val="18"/>
+        </w:rPr>
+        <w:t>organisations</w:t>
+      </w:r>
+      <w:proofErr w:type="spellEnd"/>
+      <w:r>
+        <w:rPr>
+          <w:sz w:val="18"/>
+          <w:szCs w:val="18"/>
+        </w:rPr>
+        <w:t>.</w:t>
       </w:r>
     </w:p>
     <w:p>
       <w:pPr>
         <w:pBdr>
-          <w:bottom w:val="single" w:color="2b6cb0" w:sz="8" w:space="4"/>
+          <w:bottom w:val="single" w:sz="8" w:space="4" w:color="2B6CB0"/>
         </w:pBdr>
-        <w:spacing w:after="60" w:before="60"/>
-      </w:pPr>
-      <w:r>
-        <w:rPr>
-          <w:rFonts w:ascii="Calibri" w:cs="Calibri" w:eastAsia="Calibri" w:hAnsi="Calibri"/>
+        <w:spacing w:before="60" w:after="60"/>
+      </w:pPr>
+      <w:r>
+        <w:rPr>
           <w:b/>
           <w:bCs/>
           <w:caps/>
-          <w:color w:val="1a365d"/>
-          <w:sz w:val="20"/>
-          <w:szCs w:val="20"/>
-        </w:rPr>
-        <w:t xml:space="preserve">CORE COMPETENCIES</w:t>
+          <w:color w:val="1A365D"/>
+        </w:rPr>
+        <w:t>CORE COMPETENCIES</w:t>
       </w:r>
     </w:p>
     <w:p>
@@ -143,7 +164,14 @@
           <w:sz w:val="17"/>
           <w:szCs w:val="17"/>
         </w:rPr>
-        <w:t xml:space="preserve">Content Strategy  •  Content Planning &amp; Calendars  •  Brand Storytelling  •  Campaign Content  •  Copywriting</w:t>
+        <w:t xml:space="preserve">Content Strategy  •  Content Planning &amp; Calendars  •  Brand Storytelling  •  Campaign Content  </w:t>
+      </w:r>
+      <w:r>
+        <w:rPr>
+          <w:sz w:val="17"/>
+          <w:szCs w:val="17"/>
+        </w:rPr>
+        <w:t>•  Copywriting</w:t>
       </w:r>
     </w:p>
     <w:p>
@@ -164,7 +192,23 @@
           <w:sz w:val="17"/>
           <w:szCs w:val="17"/>
         </w:rPr>
-        <w:t xml:space="preserve">Social Media Management  •  Community Management  •  Audience Engagement  •  Social Customer Care  •  Instagram, Facebook, TikTok, Pinterest</w:t>
+        <w:t xml:space="preserve">Social Media Management  •  Community Management  •  Audience Engagement  •  Social Customer Care  •  Instagram, Facebook, </w:t>
+      </w:r>
+      <w:proofErr w:type="spellStart"/>
+      <w:r>
+        <w:rPr>
+          <w:sz w:val="17"/>
+          <w:szCs w:val="17"/>
+        </w:rPr>
+        <w:t>TikTok</w:t>
+      </w:r>
+      <w:proofErr w:type="spellEnd"/>
+      <w:r>
+        <w:rPr>
+          <w:sz w:val="17"/>
+          <w:szCs w:val="17"/>
+        </w:rPr>
+        <w:t>, Pinterest</w:t>
       </w:r>
     </w:p>
     <w:p>
@@ -185,7 +229,14 @@
           <w:sz w:val="17"/>
           <w:szCs w:val="17"/>
         </w:rPr>
-        <w:t xml:space="preserve">Graphic Design  •  Short-Form Video Editing  •  Reels &amp; Visual Content  •  Creative Direction</w:t>
+        <w:t>Graphic Design  •  Short-Form Video Editing  •  Reels</w:t>
+      </w:r>
+      <w:r>
+        <w:rPr>
+          <w:sz w:val="17"/>
+          <w:szCs w:val="17"/>
+        </w:rPr>
+        <w:t xml:space="preserve"> &amp; Visual Content  •  Creative Direction</w:t>
       </w:r>
     </w:p>
     <w:p>
@@ -206,7 +257,23 @@
           <w:sz w:val="17"/>
           <w:szCs w:val="17"/>
         </w:rPr>
-        <w:t xml:space="preserve">Virtual Assistance  •  Digital Organisation  •  Research  •  Generative AI &amp; Prompt Engineering</w:t>
+        <w:t xml:space="preserve">Virtual Assistance  •  Digital </w:t>
+      </w:r>
+      <w:proofErr w:type="spellStart"/>
+      <w:r>
+        <w:rPr>
+          <w:sz w:val="17"/>
+          <w:szCs w:val="17"/>
+        </w:rPr>
+        <w:t>Organisation</w:t>
+      </w:r>
+      <w:proofErr w:type="spellEnd"/>
+      <w:r>
+        <w:rPr>
+          <w:sz w:val="17"/>
+          <w:szCs w:val="17"/>
+        </w:rPr>
+        <w:t xml:space="preserve">  •  Research  •  Generative AI &amp; Prompt Engineering</w:t>
       </w:r>
     </w:p>
     <w:p>
@@ -227,27 +294,259 @@
           <w:sz w:val="17"/>
           <w:szCs w:val="17"/>
         </w:rPr>
-        <w:t xml:space="preserve">Team Leadership  •  Creative Team Coordination  •  Community Building  •  Stakeholder Communication</w:t>
+        <w:t>Team Leadership  •  Creative Team Coordination  •  Commun</w:t>
+      </w:r>
+      <w:r>
+        <w:rPr>
+          <w:sz w:val="17"/>
+          <w:szCs w:val="17"/>
+        </w:rPr>
+        <w:t>ity Building  •  Stakeholder Communication</w:t>
       </w:r>
     </w:p>
     <w:p>
       <w:pPr>
         <w:pBdr>
-          <w:bottom w:val="single" w:color="2b6cb0" w:sz="8" w:space="4"/>
+          <w:bottom w:val="single" w:sz="8" w:space="4" w:color="2B6CB0"/>
         </w:pBdr>
-        <w:spacing w:after="60" w:before="60"/>
-      </w:pPr>
-      <w:r>
-        <w:rPr>
-          <w:rFonts w:ascii="Calibri" w:cs="Calibri" w:eastAsia="Calibri" w:hAnsi="Calibri"/>
+        <w:spacing w:before="60" w:after="60"/>
+      </w:pPr>
+      <w:r>
+        <w:rPr>
           <w:b/>
           <w:bCs/>
           <w:caps/>
-          <w:color w:val="1a365d"/>
-          <w:sz w:val="20"/>
-          <w:szCs w:val="20"/>
-        </w:rPr>
-        <w:t xml:space="preserve">PROFESSIONAL EXPERIENCE</w:t>
+          <w:color w:val="1A365D"/>
+        </w:rPr>
+        <w:t>PROFESSIONAL EXPERIENCE</w:t>
+      </w:r>
+    </w:p>
+    <w:p>
+      <w:pPr>
+        <w:rPr>
+          <w:rFonts w:asciiTheme="minorHAnsi" w:eastAsia="Times New Roman" w:hAnsiTheme="minorHAnsi" w:cstheme="minorHAnsi"/>
+          <w:b/>
+          <w:color w:val="auto"/>
+          <w:sz w:val="19"/>
+          <w:szCs w:val="19"/>
+        </w:rPr>
+      </w:pPr>
+      <w:r>
+        <w:rPr>
+          <w:rFonts w:asciiTheme="minorHAnsi" w:eastAsia="Times New Roman" w:hAnsiTheme="minorHAnsi" w:cstheme="minorHAnsi"/>
+          <w:b/>
+          <w:color w:val="222222"/>
+          <w:sz w:val="19"/>
+          <w:szCs w:val="19"/>
+          <w:shd w:val="clear" w:color="auto" w:fill="FFFFFF"/>
+        </w:rPr>
+        <w:t>THE BOTANISOUL | Founder &amp; Brand Strategist</w:t>
+      </w:r>
+    </w:p>
+    <w:p>
+      <w:pPr>
+        <w:shd w:val="clear" w:color="auto" w:fill="FFFFFF"/>
+        <w:rPr>
+          <w:rFonts w:asciiTheme="minorHAnsi" w:eastAsia="Times New Roman" w:hAnsiTheme="minorHAnsi" w:cstheme="minorHAnsi"/>
+          <w:color w:val="222222"/>
+          <w:sz w:val="17"/>
+          <w:szCs w:val="17"/>
+        </w:rPr>
+      </w:pPr>
+      <w:r>
+        <w:rPr>
+          <w:rFonts w:asciiTheme="minorHAnsi" w:eastAsia="Times New Roman" w:hAnsiTheme="minorHAnsi" w:cstheme="minorHAnsi"/>
+          <w:color w:val="222222"/>
+          <w:sz w:val="17"/>
+          <w:szCs w:val="17"/>
+        </w:rPr>
+        <w:t xml:space="preserve">Founded and developed The </w:t>
+      </w:r>
+      <w:proofErr w:type="spellStart"/>
+      <w:r>
+        <w:rPr>
+          <w:rFonts w:asciiTheme="minorHAnsi" w:eastAsia="Times New Roman" w:hAnsiTheme="minorHAnsi" w:cstheme="minorHAnsi"/>
+          <w:color w:val="222222"/>
+          <w:sz w:val="17"/>
+          <w:szCs w:val="17"/>
+        </w:rPr>
+        <w:t>BotaniSoul</w:t>
+      </w:r>
+      <w:proofErr w:type="spellEnd"/>
+      <w:r>
+        <w:rPr>
+          <w:rFonts w:asciiTheme="minorHAnsi" w:eastAsia="Times New Roman" w:hAnsiTheme="minorHAnsi" w:cstheme="minorHAnsi"/>
+          <w:color w:val="222222"/>
+          <w:sz w:val="17"/>
+          <w:szCs w:val="17"/>
+        </w:rPr>
+        <w:t>, a plant-powered wellness and lifestyle brand focused on natural self-care, botanical products, plants and conscious living. Lead the brand's creative direction, product development, digital presence and customer experience.</w:t>
+      </w:r>
+      <w:bookmarkStart w:id="0" w:name="_GoBack"/>
+      <w:bookmarkEnd w:id="0"/>
+      <w:r>
+        <w:rPr>
+          <w:rFonts w:asciiTheme="minorHAnsi" w:eastAsia="Times New Roman" w:hAnsiTheme="minorHAnsi" w:cstheme="minorHAnsi"/>
+          <w:color w:val="222222"/>
+          <w:sz w:val="17"/>
+          <w:szCs w:val="17"/>
+        </w:rPr>
+        <w:br/>
+        <w:t xml:space="preserve"> -</w:t>
+      </w:r>
+      <w:r>
+        <w:rPr>
+          <w:rFonts w:asciiTheme="minorHAnsi" w:eastAsia="Times New Roman" w:hAnsiTheme="minorHAnsi" w:cstheme="minorHAnsi"/>
+          <w:color w:val="222222"/>
+          <w:sz w:val="17"/>
+          <w:szCs w:val="17"/>
+        </w:rPr>
+        <w:t>Developed and positioned a distinctive brand identity within the natural wellness and botanical lifestyle space.</w:t>
+      </w:r>
+    </w:p>
+    <w:p>
+      <w:pPr>
+        <w:shd w:val="clear" w:color="auto" w:fill="FFFFFF"/>
+        <w:rPr>
+          <w:rFonts w:asciiTheme="minorHAnsi" w:eastAsia="Times New Roman" w:hAnsiTheme="minorHAnsi" w:cstheme="minorHAnsi"/>
+          <w:color w:val="222222"/>
+          <w:sz w:val="17"/>
+          <w:szCs w:val="17"/>
+        </w:rPr>
+      </w:pPr>
+      <w:r>
+        <w:rPr>
+          <w:rFonts w:asciiTheme="minorHAnsi" w:eastAsia="Times New Roman" w:hAnsiTheme="minorHAnsi" w:cstheme="minorHAnsi"/>
+          <w:color w:val="222222"/>
+          <w:sz w:val="17"/>
+          <w:szCs w:val="17"/>
+        </w:rPr>
+        <w:t xml:space="preserve"> </w:t>
+      </w:r>
+      <w:r>
+        <w:rPr>
+          <w:rFonts w:asciiTheme="minorHAnsi" w:eastAsia="Times New Roman" w:hAnsiTheme="minorHAnsi" w:cstheme="minorHAnsi"/>
+          <w:color w:val="222222"/>
+          <w:sz w:val="17"/>
+          <w:szCs w:val="17"/>
+        </w:rPr>
+        <w:t>- Created and developed plant-based wellness and personal care products, including herbal hair oils and botanical self-care solutions.</w:t>
+      </w:r>
+    </w:p>
+    <w:p>
+      <w:pPr>
+        <w:shd w:val="clear" w:color="auto" w:fill="FFFFFF"/>
+        <w:rPr>
+          <w:rFonts w:asciiTheme="minorHAnsi" w:eastAsia="Times New Roman" w:hAnsiTheme="minorHAnsi" w:cstheme="minorHAnsi"/>
+          <w:color w:val="222222"/>
+          <w:sz w:val="17"/>
+          <w:szCs w:val="17"/>
+        </w:rPr>
+      </w:pPr>
+      <w:r>
+        <w:rPr>
+          <w:rFonts w:asciiTheme="minorHAnsi" w:eastAsia="Times New Roman" w:hAnsiTheme="minorHAnsi" w:cstheme="minorHAnsi"/>
+          <w:color w:val="222222"/>
+          <w:sz w:val="17"/>
+          <w:szCs w:val="17"/>
+        </w:rPr>
+        <w:t xml:space="preserve"> </w:t>
+      </w:r>
+      <w:r>
+        <w:rPr>
+          <w:rFonts w:asciiTheme="minorHAnsi" w:eastAsia="Times New Roman" w:hAnsiTheme="minorHAnsi" w:cstheme="minorHAnsi"/>
+          <w:color w:val="222222"/>
+          <w:sz w:val="17"/>
+          <w:szCs w:val="17"/>
+        </w:rPr>
+        <w:t>- Produced engaging visual content, product photography, videos and educational content to build brand awareness and community.</w:t>
+      </w:r>
+    </w:p>
+    <w:p>
+      <w:pPr>
+        <w:shd w:val="clear" w:color="auto" w:fill="FFFFFF"/>
+        <w:rPr>
+          <w:rFonts w:asciiTheme="minorHAnsi" w:eastAsia="Times New Roman" w:hAnsiTheme="minorHAnsi" w:cstheme="minorHAnsi"/>
+          <w:color w:val="222222"/>
+          <w:sz w:val="17"/>
+          <w:szCs w:val="17"/>
+        </w:rPr>
+      </w:pPr>
+      <w:r>
+        <w:rPr>
+          <w:rFonts w:asciiTheme="minorHAnsi" w:eastAsia="Times New Roman" w:hAnsiTheme="minorHAnsi" w:cstheme="minorHAnsi"/>
+          <w:color w:val="222222"/>
+          <w:sz w:val="17"/>
+          <w:szCs w:val="17"/>
+        </w:rPr>
+        <w:t xml:space="preserve"> </w:t>
+      </w:r>
+      <w:r>
+        <w:rPr>
+          <w:rFonts w:asciiTheme="minorHAnsi" w:eastAsia="Times New Roman" w:hAnsiTheme="minorHAnsi" w:cstheme="minorHAnsi"/>
+          <w:color w:val="222222"/>
+          <w:sz w:val="17"/>
+          <w:szCs w:val="17"/>
+        </w:rPr>
+        <w:t>- Managed product development, packaging concepts, customer engagement and brand storytelling.</w:t>
+      </w:r>
+    </w:p>
+    <w:p>
+      <w:pPr>
+        <w:shd w:val="clear" w:color="auto" w:fill="FFFFFF"/>
+        <w:rPr>
+          <w:rFonts w:asciiTheme="minorHAnsi" w:eastAsia="Times New Roman" w:hAnsiTheme="minorHAnsi" w:cstheme="minorHAnsi"/>
+          <w:color w:val="222222"/>
+          <w:sz w:val="17"/>
+          <w:szCs w:val="17"/>
+        </w:rPr>
+      </w:pPr>
+      <w:r>
+        <w:rPr>
+          <w:rFonts w:asciiTheme="minorHAnsi" w:eastAsia="Times New Roman" w:hAnsiTheme="minorHAnsi" w:cstheme="minorHAnsi"/>
+          <w:color w:val="222222"/>
+          <w:sz w:val="17"/>
+          <w:szCs w:val="17"/>
+        </w:rPr>
+        <w:t xml:space="preserve"> </w:t>
+      </w:r>
+      <w:r>
+        <w:rPr>
+          <w:rFonts w:asciiTheme="minorHAnsi" w:eastAsia="Times New Roman" w:hAnsiTheme="minorHAnsi" w:cstheme="minorHAnsi"/>
+          <w:color w:val="222222"/>
+          <w:sz w:val="17"/>
+          <w:szCs w:val="17"/>
+        </w:rPr>
+        <w:t>- Built experience in entrepreneurship, digital marketing, e-commerce, creative strategy and community building.</w:t>
+      </w:r>
+    </w:p>
+    <w:p>
+      <w:pPr>
+        <w:shd w:val="clear" w:color="auto" w:fill="FFFFFF"/>
+        <w:rPr>
+          <w:rFonts w:asciiTheme="minorHAnsi" w:eastAsia="Times New Roman" w:hAnsiTheme="minorHAnsi" w:cstheme="minorHAnsi"/>
+          <w:color w:val="222222"/>
+          <w:sz w:val="17"/>
+          <w:szCs w:val="17"/>
+        </w:rPr>
+      </w:pPr>
+      <w:r>
+        <w:rPr>
+          <w:rFonts w:asciiTheme="minorHAnsi" w:eastAsia="Times New Roman" w:hAnsiTheme="minorHAnsi" w:cstheme="minorHAnsi"/>
+          <w:color w:val="222222"/>
+          <w:sz w:val="17"/>
+          <w:szCs w:val="17"/>
+        </w:rPr>
+        <w:t xml:space="preserve"> </w:t>
+      </w:r>
+      <w:r>
+        <w:rPr>
+          <w:rFonts w:asciiTheme="minorHAnsi" w:eastAsia="Times New Roman" w:hAnsiTheme="minorHAnsi" w:cstheme="minorHAnsi"/>
+          <w:color w:val="222222"/>
+          <w:sz w:val="17"/>
+          <w:szCs w:val="17"/>
+        </w:rPr>
+        <w:t>- Participated in markets and physical selling opportunities to introduce products directly to customers and gather consumer insights.</w:t>
       </w:r>
     </w:p>
     <w:p>
@@ -255,7 +554,7 @@
         <w:tabs>
           <w:tab w:val="right" w:pos="11160"/>
         </w:tabs>
-        <w:spacing w:after="0" w:before="80"/>
+        <w:spacing w:before="80"/>
       </w:pPr>
       <w:r>
         <w:rPr>
@@ -264,15 +563,25 @@
           <w:sz w:val="19"/>
           <w:szCs w:val="19"/>
         </w:rPr>
-        <w:t xml:space="preserve">Media Team Lead &amp; Content Strategist</w:t>
-      </w:r>
-      <w:r>
-        <w:rPr>
-          <w:color w:val="4a5568"/>
-          <w:sz w:val="17"/>
-          <w:szCs w:val="17"/>
-        </w:rPr>
-        <w:t xml:space="preserve">	January 2026 – Present</w:t>
+        <w:t>M</w:t>
+      </w:r>
+      <w:r>
+        <w:rPr>
+          <w:b/>
+          <w:bCs/>
+          <w:sz w:val="19"/>
+          <w:szCs w:val="19"/>
+        </w:rPr>
+        <w:t>edia Team Lead &amp; Content Strategist</w:t>
+      </w:r>
+      <w:r>
+        <w:rPr>
+          <w:color w:val="4A5568"/>
+          <w:sz w:val="17"/>
+          <w:szCs w:val="17"/>
+        </w:rPr>
+        <w:tab/>
+        <w:t>January 2026 – Present</w:t>
       </w:r>
     </w:p>
     <w:p>
@@ -283,11 +592,11 @@
         <w:rPr>
           <w:i/>
           <w:iCs/>
-          <w:color w:val="4a5568"/>
-          <w:sz w:val="17"/>
-          <w:szCs w:val="17"/>
-        </w:rPr>
-        <w:t xml:space="preserve">International Christian Centre (ICC-Meru)  |  Media Team Lead / Volunteer</w:t>
+          <w:color w:val="4A5568"/>
+          <w:sz w:val="17"/>
+          <w:szCs w:val="17"/>
+        </w:rPr>
+        <w:t>International Christian Centre (ICC-Meru)  |  Media Team Lead / Volunteer</w:t>
       </w:r>
     </w:p>
     <w:p>
@@ -304,7 +613,30 @@
           <w:sz w:val="17"/>
           <w:szCs w:val="17"/>
         </w:rPr>
-        <w:t xml:space="preserve">Lead the Media Team in planning and executing creative and digital communication activities for community programmes and events.</w:t>
+        <w:t xml:space="preserve">Lead the Media Team in planning and executing creative </w:t>
+      </w:r>
+      <w:r>
+        <w:rPr>
+          <w:sz w:val="17"/>
+          <w:szCs w:val="17"/>
+        </w:rPr>
+        <w:t xml:space="preserve">and digital communication activities for community </w:t>
+      </w:r>
+      <w:proofErr w:type="spellStart"/>
+      <w:r>
+        <w:rPr>
+          <w:sz w:val="17"/>
+          <w:szCs w:val="17"/>
+        </w:rPr>
+        <w:t>programmes</w:t>
+      </w:r>
+      <w:proofErr w:type="spellEnd"/>
+      <w:r>
+        <w:rPr>
+          <w:sz w:val="17"/>
+          <w:szCs w:val="17"/>
+        </w:rPr>
+        <w:t xml:space="preserve"> and events.</w:t>
       </w:r>
     </w:p>
     <w:p>
@@ -321,7 +653,7 @@
           <w:sz w:val="17"/>
           <w:szCs w:val="17"/>
         </w:rPr>
-        <w:t xml:space="preserve">Shape content strategy and develop engaging visual and video content that strengthens community engagement and storytelling.</w:t>
+        <w:t>Shape content strategy and develop engaging visual and video content that strengthens community engagement and storytelling.</w:t>
       </w:r>
     </w:p>
     <w:p>
@@ -338,7 +670,14 @@
           <w:sz w:val="17"/>
           <w:szCs w:val="17"/>
         </w:rPr>
-        <w:t xml:space="preserve">Coordinate creative contributors and foster collaboration across media and creative volunteers.</w:t>
+        <w:t>Coordinate creative contributors and foster collaboration</w:t>
+      </w:r>
+      <w:r>
+        <w:rPr>
+          <w:sz w:val="17"/>
+          <w:szCs w:val="17"/>
+        </w:rPr>
+        <w:t xml:space="preserve"> across media and creative volunteers.</w:t>
       </w:r>
     </w:p>
     <w:p>
@@ -355,7 +694,23 @@
           <w:sz w:val="17"/>
           <w:szCs w:val="17"/>
         </w:rPr>
-        <w:t xml:space="preserve">Provide creative direction, content planning and media coverage support for organisational activities.</w:t>
+        <w:t xml:space="preserve">Provide creative direction, content planning and media coverage support for </w:t>
+      </w:r>
+      <w:proofErr w:type="spellStart"/>
+      <w:r>
+        <w:rPr>
+          <w:sz w:val="17"/>
+          <w:szCs w:val="17"/>
+        </w:rPr>
+        <w:t>organisational</w:t>
+      </w:r>
+      <w:proofErr w:type="spellEnd"/>
+      <w:r>
+        <w:rPr>
+          <w:sz w:val="17"/>
+          <w:szCs w:val="17"/>
+        </w:rPr>
+        <w:t xml:space="preserve"> activities.</w:t>
       </w:r>
     </w:p>
     <w:p>
@@ -372,7 +727,7 @@
           <w:sz w:val="17"/>
           <w:szCs w:val="17"/>
         </w:rPr>
-        <w:t xml:space="preserve">Build team capacity by mentoring volunteers and encouraging active participation in media projects.</w:t>
+        <w:t>Build team capacity by mentoring volunteers and encouraging active participation in media projects.</w:t>
       </w:r>
     </w:p>
     <w:p>
@@ -380,7 +735,7 @@
         <w:tabs>
           <w:tab w:val="right" w:pos="11160"/>
         </w:tabs>
-        <w:spacing w:after="0" w:before="60"/>
+        <w:spacing w:before="60"/>
       </w:pPr>
       <w:r>
         <w:rPr>
@@ -389,15 +744,16 @@
           <w:sz w:val="19"/>
           <w:szCs w:val="19"/>
         </w:rPr>
-        <w:t xml:space="preserve">Content Strategist &amp; Social Media Manager</w:t>
-      </w:r>
-      <w:r>
-        <w:rPr>
-          <w:color w:val="4a5568"/>
-          <w:sz w:val="17"/>
-          <w:szCs w:val="17"/>
-        </w:rPr>
-        <w:t xml:space="preserve">	January 2023 – March 2026</w:t>
+        <w:t>Content Strategist &amp; Social Media Manager</w:t>
+      </w:r>
+      <w:r>
+        <w:rPr>
+          <w:color w:val="4A5568"/>
+          <w:sz w:val="17"/>
+          <w:szCs w:val="17"/>
+        </w:rPr>
+        <w:tab/>
+        <w:t>January 2023 – March 2026</w:t>
       </w:r>
     </w:p>
     <w:p>
@@ -408,11 +764,11 @@
         <w:rPr>
           <w:i/>
           <w:iCs/>
-          <w:color w:val="4a5568"/>
-          <w:sz w:val="17"/>
-          <w:szCs w:val="17"/>
-        </w:rPr>
-        <w:t xml:space="preserve">Solid Charm Bridal Store</w:t>
+          <w:color w:val="4A5568"/>
+          <w:sz w:val="17"/>
+          <w:szCs w:val="17"/>
+        </w:rPr>
+        <w:t>Solid Charm Bridal Store</w:t>
       </w:r>
     </w:p>
     <w:p>
@@ -429,7 +785,14 @@
           <w:sz w:val="17"/>
           <w:szCs w:val="17"/>
         </w:rPr>
-        <w:t xml:space="preserve">Developed and executed social media and content strategies that increased brand visibility and audience engagement across Instagram, Facebook and related platforms.</w:t>
+        <w:t>Developed and executed social media and content strategies that increased brand visibility and audience engagement across Instagram, Facebook and related platforms</w:t>
+      </w:r>
+      <w:r>
+        <w:rPr>
+          <w:sz w:val="17"/>
+          <w:szCs w:val="17"/>
+        </w:rPr>
+        <w:t>.</w:t>
       </w:r>
     </w:p>
     <w:p>
@@ -446,7 +809,7 @@
           <w:sz w:val="17"/>
           <w:szCs w:val="17"/>
         </w:rPr>
-        <w:t xml:space="preserve">Managed day-to-day content creation, scheduling and community interactions while maintaining a consistent brand visual identity.</w:t>
+        <w:t>Managed day-to-day content creation, scheduling and community interactions while maintaining a consistent brand visual identity.</w:t>
       </w:r>
     </w:p>
     <w:p>
@@ -463,7 +826,7 @@
           <w:sz w:val="17"/>
           <w:szCs w:val="17"/>
         </w:rPr>
-        <w:t xml:space="preserve">Planned and delivered campaign content and ongoing brand communication that supported business objectives.</w:t>
+        <w:t>Planned and delivered campaign content and ongoing brand communication that supported business objectives.</w:t>
       </w:r>
     </w:p>
     <w:p>
@@ -480,7 +843,7 @@
           <w:sz w:val="17"/>
           <w:szCs w:val="17"/>
         </w:rPr>
-        <w:t xml:space="preserve">Handled social media customer care and online community management, improving response quality and customer experience.</w:t>
+        <w:t>Handled social media customer care and online community management, improving response quality and customer experience.</w:t>
       </w:r>
     </w:p>
     <w:p>
@@ -497,7 +860,7 @@
           <w:sz w:val="17"/>
           <w:szCs w:val="17"/>
         </w:rPr>
-        <w:t xml:space="preserve">Provided virtual administrative support and coordinated digital business activities to ensure smooth online operations.</w:t>
+        <w:t>Provided virtual administrative support and coordinated digital business activities to ensure smooth online operations.</w:t>
       </w:r>
     </w:p>
     <w:p>
@@ -505,7 +868,7 @@
         <w:tabs>
           <w:tab w:val="right" w:pos="11160"/>
         </w:tabs>
-        <w:spacing w:after="0" w:before="60"/>
+        <w:spacing w:before="60"/>
       </w:pPr>
       <w:r>
         <w:rPr>
@@ -514,30 +877,52 @@
           <w:sz w:val="19"/>
           <w:szCs w:val="19"/>
         </w:rPr>
-        <w:t xml:space="preserve">Content Manager | Virtual Assistant | Social Media Manager</w:t>
-      </w:r>
-      <w:r>
-        <w:rPr>
-          <w:color w:val="4a5568"/>
-          <w:sz w:val="17"/>
-          <w:szCs w:val="17"/>
-        </w:rPr>
-        <w:t xml:space="preserve">	October 2017 – December 2022</w:t>
+        <w:t xml:space="preserve">Content Manager </w:t>
+      </w:r>
+      <w:r>
+        <w:rPr>
+          <w:b/>
+          <w:bCs/>
+          <w:sz w:val="19"/>
+          <w:szCs w:val="19"/>
+        </w:rPr>
+        <w:t>| Virtual Assistant | Social Media Manager</w:t>
+      </w:r>
+      <w:r>
+        <w:rPr>
+          <w:color w:val="4A5568"/>
+          <w:sz w:val="17"/>
+          <w:szCs w:val="17"/>
+        </w:rPr>
+        <w:tab/>
+        <w:t>October 2017 – December 2022</w:t>
       </w:r>
     </w:p>
     <w:p>
       <w:pPr>
         <w:spacing w:after="40"/>
       </w:pPr>
+      <w:proofErr w:type="spellStart"/>
       <w:r>
         <w:rPr>
           <w:i/>
           <w:iCs/>
-          <w:color w:val="4a5568"/>
-          <w:sz w:val="17"/>
-          <w:szCs w:val="17"/>
-        </w:rPr>
-        <w:t xml:space="preserve">Jaylifeandstyle Digital Marketing Agency</w:t>
+          <w:color w:val="4A5568"/>
+          <w:sz w:val="17"/>
+          <w:szCs w:val="17"/>
+        </w:rPr>
+        <w:t>Jaylifeandstyle</w:t>
+      </w:r>
+      <w:proofErr w:type="spellEnd"/>
+      <w:r>
+        <w:rPr>
+          <w:i/>
+          <w:iCs/>
+          <w:color w:val="4A5568"/>
+          <w:sz w:val="17"/>
+          <w:szCs w:val="17"/>
+        </w:rPr>
+        <w:t xml:space="preserve"> Digital Marketing Agency</w:t>
       </w:r>
     </w:p>
     <w:p>
@@ -554,7 +939,7 @@
           <w:sz w:val="17"/>
           <w:szCs w:val="17"/>
         </w:rPr>
-        <w:t xml:space="preserve">Supported digital marketing activities for clients across multiple industries, managing content and social media presence.</w:t>
+        <w:t>Supported digital marketing activities for clients across multiple industries, managing content and social media presence.</w:t>
       </w:r>
     </w:p>
     <w:p>
@@ -571,7 +956,14 @@
           <w:sz w:val="17"/>
           <w:szCs w:val="17"/>
         </w:rPr>
-        <w:t xml:space="preserve">Planned, created and scheduled social media content aligned with client brand guidelines and marketing objectives.</w:t>
+        <w:t>Planned, created and</w:t>
+      </w:r>
+      <w:r>
+        <w:rPr>
+          <w:sz w:val="17"/>
+          <w:szCs w:val="17"/>
+        </w:rPr>
+        <w:t xml:space="preserve"> scheduled social media content aligned with client brand guidelines and marketing objectives.</w:t>
       </w:r>
     </w:p>
     <w:p>
@@ -588,7 +980,7 @@
           <w:sz w:val="17"/>
           <w:szCs w:val="17"/>
         </w:rPr>
-        <w:t xml:space="preserve">Managed audience interactions and provided social media customer care, strengthening client-community relationships.</w:t>
+        <w:t>Managed audience interactions and provided social media customer care, strengthening client-community relationships.</w:t>
       </w:r>
     </w:p>
     <w:p>
@@ -605,7 +997,14 @@
           <w:sz w:val="17"/>
           <w:szCs w:val="17"/>
         </w:rPr>
-        <w:t xml:space="preserve">Coordinated digital content production to boost online brand visibility and engagement for agency clients.</w:t>
+        <w:t>Coordinated digital content production to bo</w:t>
+      </w:r>
+      <w:r>
+        <w:rPr>
+          <w:sz w:val="17"/>
+          <w:szCs w:val="17"/>
+        </w:rPr>
+        <w:t>ost online brand visibility and engagement for agency clients.</w:t>
       </w:r>
     </w:p>
     <w:p>
@@ -622,7 +1021,7 @@
           <w:sz w:val="17"/>
           <w:szCs w:val="17"/>
         </w:rPr>
-        <w:t xml:space="preserve">Delivered virtual administrative support that improved coordination of day-to-day digital marketing operations.</w:t>
+        <w:t>Delivered virtual administrative support that improved coordination of day-to-day digital marketing operations.</w:t>
       </w:r>
     </w:p>
     <w:p>
@@ -630,7 +1029,7 @@
         <w:tabs>
           <w:tab w:val="right" w:pos="11160"/>
         </w:tabs>
-        <w:spacing w:after="0" w:before="60"/>
+        <w:spacing w:before="60"/>
       </w:pPr>
       <w:r>
         <w:rPr>
@@ -639,15 +1038,16 @@
           <w:sz w:val="19"/>
           <w:szCs w:val="19"/>
         </w:rPr>
-        <w:t xml:space="preserve">Graphic Designer | Content Strategist | Social Media Manager</w:t>
-      </w:r>
-      <w:r>
-        <w:rPr>
-          <w:color w:val="4a5568"/>
-          <w:sz w:val="17"/>
-          <w:szCs w:val="17"/>
-        </w:rPr>
-        <w:t xml:space="preserve">	2021 – 2024</w:t>
+        <w:t>Graphic Designer | Content Strategist | Social Media Manager</w:t>
+      </w:r>
+      <w:r>
+        <w:rPr>
+          <w:color w:val="4A5568"/>
+          <w:sz w:val="17"/>
+          <w:szCs w:val="17"/>
+        </w:rPr>
+        <w:tab/>
+        <w:t>2021 – 2024</w:t>
       </w:r>
     </w:p>
     <w:p>
@@ -658,11 +1058,21 @@
         <w:rPr>
           <w:i/>
           <w:iCs/>
-          <w:color w:val="4a5568"/>
-          <w:sz w:val="17"/>
-          <w:szCs w:val="17"/>
-        </w:rPr>
-        <w:t xml:space="preserve">Square Meter Consultants</w:t>
+          <w:color w:val="4A5568"/>
+          <w:sz w:val="17"/>
+          <w:szCs w:val="17"/>
+        </w:rPr>
+        <w:t>Square M</w:t>
+      </w:r>
+      <w:r>
+        <w:rPr>
+          <w:i/>
+          <w:iCs/>
+          <w:color w:val="4A5568"/>
+          <w:sz w:val="17"/>
+          <w:szCs w:val="17"/>
+        </w:rPr>
+        <w:t>eter Consultants</w:t>
       </w:r>
     </w:p>
     <w:p>
@@ -679,7 +1089,7 @@
           <w:sz w:val="17"/>
           <w:szCs w:val="17"/>
         </w:rPr>
-        <w:t xml:space="preserve">Designed visual content and graphics that supported brand communication and marketing campaigns.</w:t>
+        <w:t>Designed visual content and graphics that supported brand communication and marketing campaigns.</w:t>
       </w:r>
     </w:p>
     <w:p>
@@ -696,7 +1106,7 @@
           <w:sz w:val="17"/>
           <w:szCs w:val="17"/>
         </w:rPr>
-        <w:t xml:space="preserve">Created and implemented content strategies for social media and digital platforms aligned with business goals.</w:t>
+        <w:t>Created and implemented content strategies for social media and digital platforms aligned with business goals.</w:t>
       </w:r>
     </w:p>
     <w:p>
@@ -713,7 +1123,14 @@
           <w:sz w:val="17"/>
           <w:szCs w:val="17"/>
         </w:rPr>
-        <w:t xml:space="preserve">Managed social media content to ensure consistent brand messaging and strengthened the company's digital presence.</w:t>
+        <w:t>Managed social media content to</w:t>
+      </w:r>
+      <w:r>
+        <w:rPr>
+          <w:sz w:val="17"/>
+          <w:szCs w:val="17"/>
+        </w:rPr>
+        <w:t xml:space="preserve"> ensure consistent brand messaging and strengthened the company's digital presence.</w:t>
       </w:r>
     </w:p>
     <w:p>
@@ -730,7 +1147,7 @@
           <w:sz w:val="17"/>
           <w:szCs w:val="17"/>
         </w:rPr>
-        <w:t xml:space="preserve">Combined graphic design, content strategy and social media management to deliver cohesive marketing communication.</w:t>
+        <w:t>Combined graphic design, content strategy and social media management to deliver cohesive marketing communication.</w:t>
       </w:r>
     </w:p>
     <w:p>
@@ -738,7 +1155,7 @@
         <w:tabs>
           <w:tab w:val="right" w:pos="11160"/>
         </w:tabs>
-        <w:spacing w:after="0" w:before="60"/>
+        <w:spacing w:before="60"/>
       </w:pPr>
       <w:r>
         <w:rPr>
@@ -747,15 +1164,16 @@
           <w:sz w:val="19"/>
           <w:szCs w:val="19"/>
         </w:rPr>
-        <w:t xml:space="preserve">Valuation Department Intern</w:t>
-      </w:r>
-      <w:r>
-        <w:rPr>
-          <w:color w:val="4a5568"/>
-          <w:sz w:val="17"/>
-          <w:szCs w:val="17"/>
-        </w:rPr>
-        <w:t xml:space="preserve">	October 2016 – January 2017</w:t>
+        <w:t>Valuation Department Intern</w:t>
+      </w:r>
+      <w:r>
+        <w:rPr>
+          <w:color w:val="4A5568"/>
+          <w:sz w:val="17"/>
+          <w:szCs w:val="17"/>
+        </w:rPr>
+        <w:tab/>
+        <w:t>October 2016 – January 2017</w:t>
       </w:r>
     </w:p>
     <w:p>
@@ -766,11 +1184,21 @@
         <w:rPr>
           <w:i/>
           <w:iCs/>
-          <w:color w:val="4a5568"/>
-          <w:sz w:val="17"/>
-          <w:szCs w:val="17"/>
-        </w:rPr>
-        <w:t xml:space="preserve">Knight Frank Kenya</w:t>
+          <w:color w:val="4A5568"/>
+          <w:sz w:val="17"/>
+          <w:szCs w:val="17"/>
+        </w:rPr>
+        <w:t>K</w:t>
+      </w:r>
+      <w:r>
+        <w:rPr>
+          <w:i/>
+          <w:iCs/>
+          <w:color w:val="4A5568"/>
+          <w:sz w:val="17"/>
+          <w:szCs w:val="17"/>
+        </w:rPr>
+        <w:t>night Frank Kenya</w:t>
       </w:r>
     </w:p>
     <w:p>
@@ -787,7 +1215,8 @@
           <w:sz w:val="17"/>
           <w:szCs w:val="17"/>
         </w:rPr>
-        <w:t xml:space="preserve">Supported the Valuation Department with research, documentation and professional administrative tasks.</w:t>
+        <w:lastRenderedPageBreak/>
+        <w:t>Supported the Valuation Department with research, documentation and professional administrative tasks.</w:t>
       </w:r>
     </w:p>
     <w:p>
@@ -804,27 +1233,40 @@
           <w:sz w:val="17"/>
           <w:szCs w:val="17"/>
         </w:rPr>
-        <w:t xml:space="preserve">Gained foundational experience in a corporate environment, developing strong skills in communication, organisation and teamwork.</w:t>
+        <w:t xml:space="preserve">Gained foundational experience in a corporate environment, developing strong skills in communication, </w:t>
+      </w:r>
+      <w:proofErr w:type="spellStart"/>
+      <w:r>
+        <w:rPr>
+          <w:sz w:val="17"/>
+          <w:szCs w:val="17"/>
+        </w:rPr>
+        <w:t>organisation</w:t>
+      </w:r>
+      <w:proofErr w:type="spellEnd"/>
+      <w:r>
+        <w:rPr>
+          <w:sz w:val="17"/>
+          <w:szCs w:val="17"/>
+        </w:rPr>
+        <w:t xml:space="preserve"> and teamwork.</w:t>
       </w:r>
     </w:p>
     <w:p>
       <w:pPr>
         <w:pBdr>
-          <w:bottom w:val="single" w:color="2b6cb0" w:sz="8" w:space="4"/>
+          <w:bottom w:val="single" w:sz="8" w:space="4" w:color="2B6CB0"/>
         </w:pBdr>
-        <w:spacing w:after="60" w:before="60"/>
-      </w:pPr>
-      <w:r>
-        <w:rPr>
-          <w:rFonts w:ascii="Calibri" w:cs="Calibri" w:eastAsia="Calibri" w:hAnsi="Calibri"/>
+        <w:spacing w:before="60" w:after="60"/>
+      </w:pPr>
+      <w:r>
+        <w:rPr>
           <w:b/>
           <w:bCs/>
           <w:caps/>
-          <w:color w:val="1a365d"/>
-          <w:sz w:val="20"/>
-          <w:szCs w:val="20"/>
-        </w:rPr>
-        <w:t xml:space="preserve">EDUCATION</w:t>
+          <w:color w:val="1A365D"/>
+        </w:rPr>
+        <w:t>EDUCATION</w:t>
       </w:r>
     </w:p>
     <w:p>
@@ -838,7 +1280,7 @@
           <w:sz w:val="18"/>
           <w:szCs w:val="18"/>
         </w:rPr>
-        <w:t xml:space="preserve">Bachelor of Real Estate</w:t>
+        <w:t>Bachelor of Real Estate</w:t>
       </w:r>
       <w:r>
         <w:rPr>
@@ -856,11 +1298,33 @@
         <w:rPr>
           <w:i/>
           <w:iCs/>
-          <w:color w:val="4a5568"/>
-          <w:sz w:val="17"/>
-          <w:szCs w:val="17"/>
-        </w:rPr>
-        <w:t xml:space="preserve">Second Class Honours, Upper Division</w:t>
+          <w:color w:val="4A5568"/>
+          <w:sz w:val="17"/>
+          <w:szCs w:val="17"/>
+        </w:rPr>
+        <w:t xml:space="preserve">Second Class </w:t>
+      </w:r>
+      <w:proofErr w:type="spellStart"/>
+      <w:r>
+        <w:rPr>
+          <w:i/>
+          <w:iCs/>
+          <w:color w:val="4A5568"/>
+          <w:sz w:val="17"/>
+          <w:szCs w:val="17"/>
+        </w:rPr>
+        <w:t>Honours</w:t>
+      </w:r>
+      <w:proofErr w:type="spellEnd"/>
+      <w:r>
+        <w:rPr>
+          <w:i/>
+          <w:iCs/>
+          <w:color w:val="4A5568"/>
+          <w:sz w:val="17"/>
+          <w:szCs w:val="17"/>
+        </w:rPr>
+        <w:t>, Upper Division</w:t>
       </w:r>
     </w:p>
     <w:p>
@@ -874,34 +1338,47 @@
           <w:sz w:val="18"/>
           <w:szCs w:val="18"/>
         </w:rPr>
-        <w:t xml:space="preserve">Kenya Certificate of Secondary Education</w:t>
+        <w:t>Kenya Certificate of Secondary Education</w:t>
       </w:r>
       <w:r>
         <w:rPr>
           <w:sz w:val="18"/>
           <w:szCs w:val="18"/>
         </w:rPr>
-        <w:t xml:space="preserve">  —  Materi Girls High School</w:t>
+        <w:t xml:space="preserve">  —  </w:t>
+      </w:r>
+      <w:proofErr w:type="spellStart"/>
+      <w:r>
+        <w:rPr>
+          <w:sz w:val="18"/>
+          <w:szCs w:val="18"/>
+        </w:rPr>
+        <w:t>Materi</w:t>
+      </w:r>
+      <w:proofErr w:type="spellEnd"/>
+      <w:r>
+        <w:rPr>
+          <w:sz w:val="18"/>
+          <w:szCs w:val="18"/>
+        </w:rPr>
+        <w:t xml:space="preserve"> Girls High School</w:t>
       </w:r>
     </w:p>
     <w:p>
       <w:pPr>
         <w:pBdr>
-          <w:bottom w:val="single" w:color="2b6cb0" w:sz="8" w:space="4"/>
+          <w:bottom w:val="single" w:sz="8" w:space="4" w:color="2B6CB0"/>
         </w:pBdr>
-        <w:spacing w:after="60" w:before="40"/>
-      </w:pPr>
-      <w:r>
-        <w:rPr>
-          <w:rFonts w:ascii="Calibri" w:cs="Calibri" w:eastAsia="Calibri" w:hAnsi="Calibri"/>
+        <w:spacing w:before="40" w:after="60"/>
+      </w:pPr>
+      <w:r>
+        <w:rPr>
           <w:b/>
           <w:bCs/>
           <w:caps/>
-          <w:color w:val="1a365d"/>
-          <w:sz w:val="20"/>
-          <w:szCs w:val="20"/>
-        </w:rPr>
-        <w:t xml:space="preserve">PROFESSIONAL TRAINING &amp; CERTIFICATIONS</w:t>
+          <w:color w:val="1A365D"/>
+        </w:rPr>
+        <w:t>PROFESSIONAL TRAINING &amp; CERTIFICATIONS</w:t>
       </w:r>
     </w:p>
     <w:p>
@@ -915,7 +1392,7 @@
           <w:sz w:val="17"/>
           <w:szCs w:val="17"/>
         </w:rPr>
-        <w:t xml:space="preserve">Virtual Assistant Certificate</w:t>
+        <w:t>Virtual Assistant Certificate</w:t>
       </w:r>
       <w:r>
         <w:rPr>
@@ -936,7 +1413,16 @@
           <w:sz w:val="17"/>
           <w:szCs w:val="17"/>
         </w:rPr>
-        <w:t xml:space="preserve">Generative AI: Prompt Engineering Basics</w:t>
+        <w:t>Gener</w:t>
+      </w:r>
+      <w:r>
+        <w:rPr>
+          <w:b/>
+          <w:bCs/>
+          <w:sz w:val="17"/>
+          <w:szCs w:val="17"/>
+        </w:rPr>
+        <w:t>ative AI: Prompt Engineering Basics</w:t>
       </w:r>
       <w:r>
         <w:rPr>
@@ -949,128 +1435,97 @@
     <w:p>
       <w:pPr>
         <w:pBdr>
-          <w:bottom w:val="single" w:color="2b6cb0" w:sz="8" w:space="4"/>
+          <w:bottom w:val="single" w:sz="8" w:space="4" w:color="2B6CB0"/>
         </w:pBdr>
-        <w:spacing w:after="60" w:before="40"/>
-      </w:pPr>
-      <w:r>
-        <w:rPr>
-          <w:rFonts w:ascii="Calibri" w:cs="Calibri" w:eastAsia="Calibri" w:hAnsi="Calibri"/>
+        <w:spacing w:before="40" w:after="60"/>
+      </w:pPr>
+      <w:r>
+        <w:rPr>
           <w:b/>
           <w:bCs/>
           <w:caps/>
-          <w:color w:val="1a365d"/>
-          <w:sz w:val="20"/>
-          <w:szCs w:val="20"/>
-        </w:rPr>
-        <w:t xml:space="preserve">TECHNICAL SKILLS</w:t>
+          <w:color w:val="1A365D"/>
+        </w:rPr>
+        <w:t>TECHNICAL SKILLS</w:t>
       </w:r>
     </w:p>
     <w:p>
       <w:pPr>
         <w:spacing w:after="40"/>
       </w:pPr>
-      <w:r>
-        <w:rPr>
-          <w:sz w:val="17"/>
-          <w:szCs w:val="17"/>
-        </w:rPr>
-        <w:t xml:space="preserve">Canva  •  CapCut  •  Meta Business Suite  •  Instagram  •  Facebook  •  TikTok  •  Pinterest  •  Google Workspace  •  Google Sheets  •  Microsoft Office  •  Content Planning Tools  •  Generative AI Tools  •  Social Media Scheduling &amp; Management</w:t>
+      <w:proofErr w:type="spellStart"/>
+      <w:r>
+        <w:rPr>
+          <w:sz w:val="17"/>
+          <w:szCs w:val="17"/>
+        </w:rPr>
+        <w:t>Canva</w:t>
+      </w:r>
+      <w:proofErr w:type="spellEnd"/>
+      <w:r>
+        <w:rPr>
+          <w:sz w:val="17"/>
+          <w:szCs w:val="17"/>
+        </w:rPr>
+        <w:t xml:space="preserve">  •  </w:t>
+      </w:r>
+      <w:proofErr w:type="spellStart"/>
+      <w:r>
+        <w:rPr>
+          <w:sz w:val="17"/>
+          <w:szCs w:val="17"/>
+        </w:rPr>
+        <w:t>CapCut</w:t>
+      </w:r>
+      <w:proofErr w:type="spellEnd"/>
+      <w:r>
+        <w:rPr>
+          <w:sz w:val="17"/>
+          <w:szCs w:val="17"/>
+        </w:rPr>
+        <w:t xml:space="preserve">  •  Meta Business Suite  •  Instagram  •  Facebook  •  </w:t>
+      </w:r>
+      <w:proofErr w:type="spellStart"/>
+      <w:r>
+        <w:rPr>
+          <w:sz w:val="17"/>
+          <w:szCs w:val="17"/>
+        </w:rPr>
+        <w:t>TikTok</w:t>
+      </w:r>
+      <w:proofErr w:type="spellEnd"/>
+      <w:r>
+        <w:rPr>
+          <w:sz w:val="17"/>
+          <w:szCs w:val="17"/>
+        </w:rPr>
+        <w:t xml:space="preserve">  •  Pinterest  •  Google Workspace  •  Google Sheets  •  Microsoft Office  •  Content Planning Tools  •  Genera</w:t>
+      </w:r>
+      <w:r>
+        <w:rPr>
+          <w:sz w:val="17"/>
+          <w:szCs w:val="17"/>
+        </w:rPr>
+        <w:t>tive AI Tools  •  Social Media Scheduling &amp; Management</w:t>
       </w:r>
     </w:p>
     <w:sectPr>
-      <w:pgSz w:w="12240" w:h="15840" w:orient="portrait"/>
+      <w:pgSz w:w="12240" w:h="15840"/>
       <w:pgMar w:top="540" w:right="540" w:bottom="540" w:left="540" w:header="708" w:footer="708" w:gutter="0"/>
-      <w:pgNumType/>
+      <w:cols w:space="720"/>
       <w:docGrid w:linePitch="360"/>
     </w:sectPr>
   </w:body>
 </w:document>
 </file>
 
-<file path=word/comments.xml><?xml version="1.0" encoding="utf-8"?>
-<w:comments xmlns:cx="http://schemas.microsoft.com/office/drawing/2014/chartex" xmlns:cx1="http://schemas.microsoft.com/office/drawing/2015/9/8/chartex" xmlns:cx2="http://schemas.microsoft.com/office/drawing/2015/10/21/chartex" xmlns:cx3="http://schemas.microsoft.com/office/drawing/2016/5/9/chartex" xmlns:cx4="http://schemas.microsoft.com/office/drawing/2016/5/10/chartex" xmlns:cx5="http://schemas.microsoft.com/office/drawing/2016/5/11/chartex" xmlns:cx6="http://schemas.microsoft.com/office/drawing/2016/5/12/chartex" xmlns:cx7="http://schemas.microsoft.com/office/drawing/2016/5/13/chartex" xmlns:cx8="http://schemas.microsoft.com/office/drawing/2016/5/14/chartex" xmlns:mc="http://schemas.openxmlformats.org/markup-compatibility/2006" xmlns:aink="http://schemas.microsoft.com/office/drawing/2016/ink" xmlns:am3d="http://schemas.microsoft.com/office/drawing/2017/model3d" xmlns:o="urn:schemas-microsoft-com:office:office" xmlns:r="http://schemas.openxmlformats.org/officeDocument/2006/relationships" xmlns:m="http://schemas.openxmlformats.org/officeDocument/2006/math" xmlns:v="urn:schemas-microsoft-com:vml" xmlns:wp14="http://schemas.microsoft.com/office/word/2010/wordprocessingDrawing" xmlns:wp="http://schemas.openxmlformats.org/drawingml/2006/wordprocessingDrawing" xmlns:w10="urn:schemas-microsoft-com:office:word" xmlns:w="http://schemas.openxmlformats.org/wordprocessingml/2006/main" xmlns:w14="http://schemas.microsoft.com/office/word/2010/wordml" xmlns:w15="http://schemas.microsoft.com/office/word/2012/wordml" xmlns:w16cex="http://schemas.microsoft.com/office/word/2018/wordml/cex" xmlns:w16cid="http://schemas.microsoft.com/office/word/2016/wordml/cid" xmlns:w16="http://schemas.microsoft.com/office/word/2018/wordml" xmlns:w16sdtdh="http://schemas.microsoft.com/office/word/2020/wordml/sdtdatahash" xmlns:w16se="http://schemas.microsoft.com/office/word/2015/wordml/symex" xmlns:wpg="http://schemas.microsoft.com/office/word/2010/wordprocessingGroup" xmlns:wpi="http://schemas.microsoft.com/office/word/2010/wordprocessingInk" xmlns:wne="http://schemas.microsoft.com/office/word/2006/wordml" xmlns:wps="http://schemas.microsoft.com/office/word/2010/wordprocessingShape"/>
-</file>
-
-<file path=word/endnotes.xml><?xml version="1.0" encoding="utf-8"?>
-<w:endnotes xmlns:wpc="http://schemas.microsoft.com/office/word/2010/wordprocessingCanvas" xmlns:mc="http://schemas.openxmlformats.org/markup-compatibility/2006" xmlns:o="urn:schemas-microsoft-com:office:office" xmlns:r="http://schemas.openxmlformats.org/officeDocument/2006/relationships" xmlns:m="http://schemas.openxmlformats.org/officeDocument/2006/math" xmlns:v="urn:schemas-microsoft-com:vml" xmlns:wp14="http://schemas.microsoft.com/office/word/2010/wordprocessingDrawing" xmlns:wp="http://schemas.openxmlformats.org/drawingml/2006/wordprocessingDrawing" xmlns:w10="urn:schemas-microsoft-com:office:word" xmlns:w="http://schemas.openxmlformats.org/wordprocessingml/2006/main" xmlns:w14="http://schemas.microsoft.com/office/word/2010/wordml" xmlns:w15="http://schemas.microsoft.com/office/word/2012/wordml" xmlns:wpg="http://schemas.microsoft.com/office/word/2010/wordprocessingGroup" xmlns:wpi="http://schemas.microsoft.com/office/word/2010/wordprocessingInk" xmlns:wne="http://schemas.microsoft.com/office/word/2006/wordml" xmlns:wps="http://schemas.microsoft.com/office/word/2010/wordprocessingShape" mc:Ignorable="w14 w15 wp14">
-  <w:endnote w:type="separator" w:id="-1">
-    <w:p>
-      <w:pPr>
-        <w:spacing w:after="0" w:line="240" w:lineRule="auto"/>
-      </w:pPr>
-      <w:r>
-        <w:rPr>
-          <w:rStyle w:val="EndnoteReference"/>
-        </w:rPr>
-        <w:endnoteRef/>
-      </w:r>
-      <w:r>
-        <w:separator/>
-      </w:r>
-    </w:p>
-  </w:endnote>
-  <w:endnote w:type="continuationSeparator" w:id="0">
-    <w:p>
-      <w:pPr>
-        <w:spacing w:after="0" w:line="240" w:lineRule="auto"/>
-      </w:pPr>
-      <w:r>
-        <w:rPr>
-          <w:rStyle w:val="EndnoteReference"/>
-        </w:rPr>
-        <w:endnoteRef/>
-      </w:r>
-      <w:r>
-        <w:continuationSeparator/>
-      </w:r>
-    </w:p>
-  </w:endnote>
-</w:endnotes>
-</file>
-
-<file path=word/footnotes.xml><?xml version="1.0" encoding="utf-8"?>
-<w:footnotes xmlns:wpc="http://schemas.microsoft.com/office/word/2010/wordprocessingCanvas" xmlns:mc="http://schemas.openxmlformats.org/markup-compatibility/2006" xmlns:o="urn:schemas-microsoft-com:office:office" xmlns:r="http://schemas.openxmlformats.org/officeDocument/2006/relationships" xmlns:m="http://schemas.openxmlformats.org/officeDocument/2006/math" xmlns:v="urn:schemas-microsoft-com:vml" xmlns:wp14="http://schemas.microsoft.com/office/word/2010/wordprocessingDrawing" xmlns:wp="http://schemas.openxmlformats.org/drawingml/2006/wordprocessingDrawing" xmlns:w10="urn:schemas-microsoft-com:office:word" xmlns:w="http://schemas.openxmlformats.org/wordprocessingml/2006/main" xmlns:w14="http://schemas.microsoft.com/office/word/2010/wordml" xmlns:w15="http://schemas.microsoft.com/office/word/2012/wordml" xmlns:wpg="http://schemas.microsoft.com/office/word/2010/wordprocessingGroup" xmlns:wpi="http://schemas.microsoft.com/office/word/2010/wordprocessingInk" xmlns:wne="http://schemas.microsoft.com/office/word/2006/wordml" xmlns:wps="http://schemas.microsoft.com/office/word/2010/wordprocessingShape" mc:Ignorable="w14 w15 wp14">
-  <w:footnote w:type="separator" w:id="-1">
-    <w:p>
-      <w:pPr>
-        <w:spacing w:after="0" w:line="240" w:lineRule="auto"/>
-      </w:pPr>
-      <w:r>
-        <w:rPr>
-          <w:rStyle w:val="FootnoteReference"/>
-        </w:rPr>
-        <w:footnoteRef/>
-      </w:r>
-      <w:r>
-        <w:separator/>
-      </w:r>
-    </w:p>
-  </w:footnote>
-  <w:footnote w:type="continuationSeparator" w:id="0">
-    <w:p>
-      <w:pPr>
-        <w:spacing w:after="0" w:line="240" w:lineRule="auto"/>
-      </w:pPr>
-      <w:r>
-        <w:rPr>
-          <w:rStyle w:val="FootnoteReference"/>
-        </w:rPr>
-        <w:footnoteRef/>
-      </w:r>
-      <w:r>
-        <w:continuationSeparator/>
-      </w:r>
-    </w:p>
-  </w:footnote>
-</w:footnotes>
-</file>
-
 <file path=word/numbering.xml><?xml version="1.0" encoding="utf-8"?>
-<w:numbering xmlns:wpc="http://schemas.microsoft.com/office/word/2010/wordprocessingCanvas" xmlns:mc="http://schemas.openxmlformats.org/markup-compatibility/2006" xmlns:o="urn:schemas-microsoft-com:office:office" xmlns:r="http://schemas.openxmlformats.org/officeDocument/2006/relationships" xmlns:m="http://schemas.openxmlformats.org/officeDocument/2006/math" xmlns:v="urn:schemas-microsoft-com:vml" xmlns:wp14="http://schemas.microsoft.com/office/word/2010/wordprocessingDrawing" xmlns:wp="http://schemas.openxmlformats.org/drawingml/2006/wordprocessingDrawing" xmlns:w10="urn:schemas-microsoft-com:office:word" xmlns:w="http://schemas.openxmlformats.org/wordprocessingml/2006/main" xmlns:w14="http://schemas.microsoft.com/office/word/2010/wordml" xmlns:w15="http://schemas.microsoft.com/office/word/2012/wordml" xmlns:wpg="http://schemas.microsoft.com/office/word/2010/wordprocessingGroup" xmlns:wpi="http://schemas.microsoft.com/office/word/2010/wordprocessingInk" xmlns:wne="http://schemas.microsoft.com/office/word/2006/wordml" xmlns:wps="http://schemas.microsoft.com/office/word/2010/wordprocessingShape" mc:Ignorable="w14 w15 wp14">
-  <w:abstractNum w:abstractNumId="1" w15:restartNumberingAfterBreak="0">
+<w:numbering xmlns:wpc="http://schemas.microsoft.com/office/word/2010/wordprocessingCanvas" xmlns:cx="http://schemas.microsoft.com/office/drawing/2014/chartex" xmlns:cx1="http://schemas.microsoft.com/office/drawing/2015/9/8/chartex" xmlns:cx2="http://schemas.microsoft.com/office/drawing/2015/10/21/chartex" xmlns:mc="http://schemas.openxmlformats.org/markup-compatibility/2006" xmlns:o="urn:schemas-microsoft-com:office:office" xmlns:r="http://schemas.openxmlformats.org/officeDocument/2006/relationships" xmlns:m="http://schemas.openxmlformats.org/officeDocument/2006/math" xmlns:v="urn:schemas-microsoft-com:vml" xmlns:wp14="http://schemas.microsoft.com/office/word/2010/wordprocessingDrawing" xmlns:wp="http://schemas.openxmlformats.org/drawingml/2006/wordprocessingDrawing" xmlns:w10="urn:schemas-microsoft-com:office:word" xmlns:w="http://schemas.openxmlformats.org/wordprocessingml/2006/main" xmlns:w14="http://schemas.microsoft.com/office/word/2010/wordml" xmlns:w15="http://schemas.microsoft.com/office/word/2012/wordml" xmlns:w16se="http://schemas.microsoft.com/office/word/2015/wordml/symex" xmlns:wpg="http://schemas.microsoft.com/office/word/2010/wordprocessingGroup" xmlns:wpi="http://schemas.microsoft.com/office/word/2010/wordprocessingInk" xmlns:wne="http://schemas.microsoft.com/office/word/2006/wordml" xmlns:wps="http://schemas.microsoft.com/office/word/2010/wordprocessingShape" mc:Ignorable="w14 w15 w16se wp14">
+  <w:abstractNum w:abstractNumId="0" w15:restartNumberingAfterBreak="0">
+    <w:nsid w:val="4D0A4980"/>
     <w:multiLevelType w:val="hybridMultilevel"/>
-    <w:lvl w:ilvl="0" w15:tentative="1">
+    <w:tmpl w:val="05A0425C"/>
+    <w:lvl w:ilvl="0" w:tplc="3760DEA6">
       <w:start w:val="1"/>
       <w:numFmt w:val="bullet"/>
       <w:lvlText w:val="●"/>
@@ -1079,7 +1534,7 @@
         <w:ind w:left="720" w:hanging="360"/>
       </w:pPr>
     </w:lvl>
-    <w:lvl w:ilvl="1" w15:tentative="1">
+    <w:lvl w:ilvl="1" w:tplc="47DE9EEA">
       <w:start w:val="1"/>
       <w:numFmt w:val="bullet"/>
       <w:lvlText w:val="○"/>
@@ -1088,7 +1543,7 @@
         <w:ind w:left="1440" w:hanging="360"/>
       </w:pPr>
     </w:lvl>
-    <w:lvl w:ilvl="2" w15:tentative="1">
+    <w:lvl w:ilvl="2" w:tplc="0C36B836">
       <w:start w:val="1"/>
       <w:numFmt w:val="bullet"/>
       <w:lvlText w:val="■"/>
@@ -1097,7 +1552,7 @@
         <w:ind w:left="2160" w:hanging="360"/>
       </w:pPr>
     </w:lvl>
-    <w:lvl w:ilvl="3" w15:tentative="1">
+    <w:lvl w:ilvl="3" w:tplc="688643C8">
       <w:start w:val="1"/>
       <w:numFmt w:val="bullet"/>
       <w:lvlText w:val="●"/>
@@ -1106,7 +1561,7 @@
         <w:ind w:left="2880" w:hanging="360"/>
       </w:pPr>
     </w:lvl>
-    <w:lvl w:ilvl="4" w15:tentative="1">
+    <w:lvl w:ilvl="4" w:tplc="A468D178">
       <w:start w:val="1"/>
       <w:numFmt w:val="bullet"/>
       <w:lvlText w:val="○"/>
@@ -1115,7 +1570,7 @@
         <w:ind w:left="3600" w:hanging="360"/>
       </w:pPr>
     </w:lvl>
-    <w:lvl w:ilvl="5" w15:tentative="1">
+    <w:lvl w:ilvl="5" w:tplc="99AAAC78">
       <w:start w:val="1"/>
       <w:numFmt w:val="bullet"/>
       <w:lvlText w:val="■"/>
@@ -1124,7 +1579,7 @@
         <w:ind w:left="4320" w:hanging="360"/>
       </w:pPr>
     </w:lvl>
-    <w:lvl w:ilvl="6" w15:tentative="1">
+    <w:lvl w:ilvl="6" w:tplc="201059D8">
       <w:start w:val="1"/>
       <w:numFmt w:val="bullet"/>
       <w:lvlText w:val="●"/>
@@ -1133,7 +1588,7 @@
         <w:ind w:left="5040" w:hanging="360"/>
       </w:pPr>
     </w:lvl>
-    <w:lvl w:ilvl="7" w15:tentative="1">
+    <w:lvl w:ilvl="7" w:tplc="4718BDF2">
       <w:start w:val="1"/>
       <w:numFmt w:val="bullet"/>
       <w:lvlText w:val="●"/>
@@ -1142,7 +1597,7 @@
         <w:ind w:left="5760" w:hanging="360"/>
       </w:pPr>
     </w:lvl>
-    <w:lvl w:ilvl="8" w15:tentative="1">
+    <w:lvl w:ilvl="8" w:tplc="5F40B0A8">
       <w:start w:val="1"/>
       <w:numFmt w:val="bullet"/>
       <w:lvlText w:val="●"/>
@@ -1152,9 +1607,124 @@
       </w:pPr>
     </w:lvl>
   </w:abstractNum>
+  <w:abstractNum w:abstractNumId="1" w15:restartNumberingAfterBreak="0">
+    <w:nsid w:val="5F6C0D49"/>
+    <w:multiLevelType w:val="hybridMultilevel"/>
+    <w:tmpl w:val="D0FCE2F8"/>
+    <w:lvl w:ilvl="0" w:tplc="04090001">
+      <w:start w:val="1"/>
+      <w:numFmt w:val="bullet"/>
+      <w:lvlText w:val=""/>
+      <w:lvlJc w:val="left"/>
+      <w:pPr>
+        <w:ind w:left="720" w:hanging="360"/>
+      </w:pPr>
+      <w:rPr>
+        <w:rFonts w:ascii="Symbol" w:hAnsi="Symbol" w:hint="default"/>
+      </w:rPr>
+    </w:lvl>
+    <w:lvl w:ilvl="1" w:tplc="04090003" w:tentative="1">
+      <w:start w:val="1"/>
+      <w:numFmt w:val="bullet"/>
+      <w:lvlText w:val="o"/>
+      <w:lvlJc w:val="left"/>
+      <w:pPr>
+        <w:ind w:left="1440" w:hanging="360"/>
+      </w:pPr>
+      <w:rPr>
+        <w:rFonts w:ascii="Courier New" w:hAnsi="Courier New" w:cs="Courier New" w:hint="default"/>
+      </w:rPr>
+    </w:lvl>
+    <w:lvl w:ilvl="2" w:tplc="04090005" w:tentative="1">
+      <w:start w:val="1"/>
+      <w:numFmt w:val="bullet"/>
+      <w:lvlText w:val=""/>
+      <w:lvlJc w:val="left"/>
+      <w:pPr>
+        <w:ind w:left="2160" w:hanging="360"/>
+      </w:pPr>
+      <w:rPr>
+        <w:rFonts w:ascii="Wingdings" w:hAnsi="Wingdings" w:hint="default"/>
+      </w:rPr>
+    </w:lvl>
+    <w:lvl w:ilvl="3" w:tplc="04090001" w:tentative="1">
+      <w:start w:val="1"/>
+      <w:numFmt w:val="bullet"/>
+      <w:lvlText w:val=""/>
+      <w:lvlJc w:val="left"/>
+      <w:pPr>
+        <w:ind w:left="2880" w:hanging="360"/>
+      </w:pPr>
+      <w:rPr>
+        <w:rFonts w:ascii="Symbol" w:hAnsi="Symbol" w:hint="default"/>
+      </w:rPr>
+    </w:lvl>
+    <w:lvl w:ilvl="4" w:tplc="04090003" w:tentative="1">
+      <w:start w:val="1"/>
+      <w:numFmt w:val="bullet"/>
+      <w:lvlText w:val="o"/>
+      <w:lvlJc w:val="left"/>
+      <w:pPr>
+        <w:ind w:left="3600" w:hanging="360"/>
+      </w:pPr>
+      <w:rPr>
+        <w:rFonts w:ascii="Courier New" w:hAnsi="Courier New" w:cs="Courier New" w:hint="default"/>
+      </w:rPr>
+    </w:lvl>
+    <w:lvl w:ilvl="5" w:tplc="04090005" w:tentative="1">
+      <w:start w:val="1"/>
+      <w:numFmt w:val="bullet"/>
+      <w:lvlText w:val=""/>
+      <w:lvlJc w:val="left"/>
+      <w:pPr>
+        <w:ind w:left="4320" w:hanging="360"/>
+      </w:pPr>
+      <w:rPr>
+        <w:rFonts w:ascii="Wingdings" w:hAnsi="Wingdings" w:hint="default"/>
+      </w:rPr>
+    </w:lvl>
+    <w:lvl w:ilvl="6" w:tplc="04090001" w:tentative="1">
+      <w:start w:val="1"/>
+      <w:numFmt w:val="bullet"/>
+      <w:lvlText w:val=""/>
+      <w:lvlJc w:val="left"/>
+      <w:pPr>
+        <w:ind w:left="5040" w:hanging="360"/>
+      </w:pPr>
+      <w:rPr>
+        <w:rFonts w:ascii="Symbol" w:hAnsi="Symbol" w:hint="default"/>
+      </w:rPr>
+    </w:lvl>
+    <w:lvl w:ilvl="7" w:tplc="04090003" w:tentative="1">
+      <w:start w:val="1"/>
+      <w:numFmt w:val="bullet"/>
+      <w:lvlText w:val="o"/>
+      <w:lvlJc w:val="left"/>
+      <w:pPr>
+        <w:ind w:left="5760" w:hanging="360"/>
+      </w:pPr>
+      <w:rPr>
+        <w:rFonts w:ascii="Courier New" w:hAnsi="Courier New" w:cs="Courier New" w:hint="default"/>
+      </w:rPr>
+    </w:lvl>
+    <w:lvl w:ilvl="8" w:tplc="04090005" w:tentative="1">
+      <w:start w:val="1"/>
+      <w:numFmt w:val="bullet"/>
+      <w:lvlText w:val=""/>
+      <w:lvlJc w:val="left"/>
+      <w:pPr>
+        <w:ind w:left="6480" w:hanging="360"/>
+      </w:pPr>
+      <w:rPr>
+        <w:rFonts w:ascii="Wingdings" w:hAnsi="Wingdings" w:hint="default"/>
+      </w:rPr>
+    </w:lvl>
+  </w:abstractNum>
   <w:abstractNum w:abstractNumId="2" w15:restartNumberingAfterBreak="0">
+    <w:nsid w:val="68C2229E"/>
     <w:multiLevelType w:val="hybridMultilevel"/>
-    <w:lvl w:ilvl="0" w15:tentative="1">
+    <w:tmpl w:val="6DC816B6"/>
+    <w:lvl w:ilvl="0" w:tplc="B9C0A5D6">
       <w:start w:val="1"/>
       <w:numFmt w:val="bullet"/>
       <w:lvlText w:val="•"/>
@@ -1163,9 +1733,161 @@
         <w:ind w:left="360" w:hanging="180"/>
       </w:pPr>
     </w:lvl>
+    <w:lvl w:ilvl="1" w:tplc="8A567304">
+      <w:numFmt w:val="decimal"/>
+      <w:lvlText w:val=""/>
+      <w:lvlJc w:val="left"/>
+    </w:lvl>
+    <w:lvl w:ilvl="2" w:tplc="ED1CCBEC">
+      <w:numFmt w:val="decimal"/>
+      <w:lvlText w:val=""/>
+      <w:lvlJc w:val="left"/>
+    </w:lvl>
+    <w:lvl w:ilvl="3" w:tplc="A00A4820">
+      <w:numFmt w:val="decimal"/>
+      <w:lvlText w:val=""/>
+      <w:lvlJc w:val="left"/>
+    </w:lvl>
+    <w:lvl w:ilvl="4" w:tplc="638EBAC4">
+      <w:numFmt w:val="decimal"/>
+      <w:lvlText w:val=""/>
+      <w:lvlJc w:val="left"/>
+    </w:lvl>
+    <w:lvl w:ilvl="5" w:tplc="71A42DF4">
+      <w:numFmt w:val="decimal"/>
+      <w:lvlText w:val=""/>
+      <w:lvlJc w:val="left"/>
+    </w:lvl>
+    <w:lvl w:ilvl="6" w:tplc="37123982">
+      <w:numFmt w:val="decimal"/>
+      <w:lvlText w:val=""/>
+      <w:lvlJc w:val="left"/>
+    </w:lvl>
+    <w:lvl w:ilvl="7" w:tplc="BB6A608A">
+      <w:numFmt w:val="decimal"/>
+      <w:lvlText w:val=""/>
+      <w:lvlJc w:val="left"/>
+    </w:lvl>
+    <w:lvl w:ilvl="8" w:tplc="01661DEA">
+      <w:numFmt w:val="decimal"/>
+      <w:lvlText w:val=""/>
+      <w:lvlJc w:val="left"/>
+    </w:lvl>
+  </w:abstractNum>
+  <w:abstractNum w:abstractNumId="3" w15:restartNumberingAfterBreak="0">
+    <w:nsid w:val="70E60016"/>
+    <w:multiLevelType w:val="hybridMultilevel"/>
+    <w:tmpl w:val="817CD0AC"/>
+    <w:lvl w:ilvl="0" w:tplc="A9DCE7F0">
+      <w:numFmt w:val="bullet"/>
+      <w:lvlText w:val="-"/>
+      <w:lvlJc w:val="left"/>
+      <w:pPr>
+        <w:ind w:left="720" w:hanging="360"/>
+      </w:pPr>
+      <w:rPr>
+        <w:rFonts w:ascii="Calibri" w:eastAsia="Times New Roman" w:hAnsi="Calibri" w:cs="Calibri" w:hint="default"/>
+      </w:rPr>
+    </w:lvl>
+    <w:lvl w:ilvl="1" w:tplc="04090003" w:tentative="1">
+      <w:start w:val="1"/>
+      <w:numFmt w:val="bullet"/>
+      <w:lvlText w:val="o"/>
+      <w:lvlJc w:val="left"/>
+      <w:pPr>
+        <w:ind w:left="1440" w:hanging="360"/>
+      </w:pPr>
+      <w:rPr>
+        <w:rFonts w:ascii="Courier New" w:hAnsi="Courier New" w:cs="Courier New" w:hint="default"/>
+      </w:rPr>
+    </w:lvl>
+    <w:lvl w:ilvl="2" w:tplc="04090005" w:tentative="1">
+      <w:start w:val="1"/>
+      <w:numFmt w:val="bullet"/>
+      <w:lvlText w:val=""/>
+      <w:lvlJc w:val="left"/>
+      <w:pPr>
+        <w:ind w:left="2160" w:hanging="360"/>
+      </w:pPr>
+      <w:rPr>
+        <w:rFonts w:ascii="Wingdings" w:hAnsi="Wingdings" w:hint="default"/>
+      </w:rPr>
+    </w:lvl>
+    <w:lvl w:ilvl="3" w:tplc="04090001" w:tentative="1">
+      <w:start w:val="1"/>
+      <w:numFmt w:val="bullet"/>
+      <w:lvlText w:val=""/>
+      <w:lvlJc w:val="left"/>
+      <w:pPr>
+        <w:ind w:left="2880" w:hanging="360"/>
+      </w:pPr>
+      <w:rPr>
+        <w:rFonts w:ascii="Symbol" w:hAnsi="Symbol" w:hint="default"/>
+      </w:rPr>
+    </w:lvl>
+    <w:lvl w:ilvl="4" w:tplc="04090003" w:tentative="1">
+      <w:start w:val="1"/>
+      <w:numFmt w:val="bullet"/>
+      <w:lvlText w:val="o"/>
+      <w:lvlJc w:val="left"/>
+      <w:pPr>
+        <w:ind w:left="3600" w:hanging="360"/>
+      </w:pPr>
+      <w:rPr>
+        <w:rFonts w:ascii="Courier New" w:hAnsi="Courier New" w:cs="Courier New" w:hint="default"/>
+      </w:rPr>
+    </w:lvl>
+    <w:lvl w:ilvl="5" w:tplc="04090005" w:tentative="1">
+      <w:start w:val="1"/>
+      <w:numFmt w:val="bullet"/>
+      <w:lvlText w:val=""/>
+      <w:lvlJc w:val="left"/>
+      <w:pPr>
+        <w:ind w:left="4320" w:hanging="360"/>
+      </w:pPr>
+      <w:rPr>
+        <w:rFonts w:ascii="Wingdings" w:hAnsi="Wingdings" w:hint="default"/>
+      </w:rPr>
+    </w:lvl>
+    <w:lvl w:ilvl="6" w:tplc="04090001" w:tentative="1">
+      <w:start w:val="1"/>
+      <w:numFmt w:val="bullet"/>
+      <w:lvlText w:val=""/>
+      <w:lvlJc w:val="left"/>
+      <w:pPr>
+        <w:ind w:left="5040" w:hanging="360"/>
+      </w:pPr>
+      <w:rPr>
+        <w:rFonts w:ascii="Symbol" w:hAnsi="Symbol" w:hint="default"/>
+      </w:rPr>
+    </w:lvl>
+    <w:lvl w:ilvl="7" w:tplc="04090003" w:tentative="1">
+      <w:start w:val="1"/>
+      <w:numFmt w:val="bullet"/>
+      <w:lvlText w:val="o"/>
+      <w:lvlJc w:val="left"/>
+      <w:pPr>
+        <w:ind w:left="5760" w:hanging="360"/>
+      </w:pPr>
+      <w:rPr>
+        <w:rFonts w:ascii="Courier New" w:hAnsi="Courier New" w:cs="Courier New" w:hint="default"/>
+      </w:rPr>
+    </w:lvl>
+    <w:lvl w:ilvl="8" w:tplc="04090005" w:tentative="1">
+      <w:start w:val="1"/>
+      <w:numFmt w:val="bullet"/>
+      <w:lvlText w:val=""/>
+      <w:lvlJc w:val="left"/>
+      <w:pPr>
+        <w:ind w:left="6480" w:hanging="360"/>
+      </w:pPr>
+      <w:rPr>
+        <w:rFonts w:ascii="Wingdings" w:hAnsi="Wingdings" w:hint="default"/>
+      </w:rPr>
+    </w:lvl>
   </w:abstractNum>
   <w:num w:numId="1">
-    <w:abstractNumId w:val="1"/>
+    <w:abstractNumId w:val="0"/>
     <w:lvlOverride w:ilvl="0">
       <w:startOverride w:val="1"/>
     </w:lvlOverride>
@@ -1176,37 +1898,411 @@
       <w:startOverride w:val="1"/>
     </w:lvlOverride>
   </w:num>
+  <w:num w:numId="3">
+    <w:abstractNumId w:val="1"/>
+  </w:num>
+  <w:num w:numId="4">
+    <w:abstractNumId w:val="3"/>
+  </w:num>
 </w:numbering>
 </file>
 
 <file path=word/styles.xml><?xml version="1.0" encoding="utf-8"?>
-<w:styles xmlns:mc="http://schemas.openxmlformats.org/markup-compatibility/2006" xmlns:r="http://schemas.openxmlformats.org/officeDocument/2006/relationships" xmlns:w="http://schemas.openxmlformats.org/wordprocessingml/2006/main" xmlns:w14="http://schemas.microsoft.com/office/word/2010/wordml" xmlns:w15="http://schemas.microsoft.com/office/word/2012/wordml" mc:Ignorable="w14 w15">
+<w:styles xmlns:mc="http://schemas.openxmlformats.org/markup-compatibility/2006" xmlns:r="http://schemas.openxmlformats.org/officeDocument/2006/relationships" xmlns:w="http://schemas.openxmlformats.org/wordprocessingml/2006/main" xmlns:w14="http://schemas.microsoft.com/office/word/2010/wordml" xmlns:w15="http://schemas.microsoft.com/office/word/2012/wordml" xmlns:w16se="http://schemas.microsoft.com/office/word/2015/wordml/symex" mc:Ignorable="w14 w15 w16se">
   <w:docDefaults>
     <w:rPrDefault>
       <w:rPr>
-        <w:rFonts w:ascii="Calibri" w:cs="Calibri" w:eastAsia="Calibri" w:hAnsi="Calibri"/>
-        <w:color w:val="1a202c"/>
-        <w:sz w:val="20"/>
-        <w:szCs w:val="20"/>
+        <w:rFonts w:ascii="Calibri" w:eastAsia="Calibri" w:hAnsi="Calibri" w:cs="Calibri"/>
+        <w:color w:val="1A202C"/>
+        <w:lang w:val="en-US" w:eastAsia="en-US" w:bidi="ar-SA"/>
       </w:rPr>
     </w:rPrDefault>
     <w:pPrDefault/>
   </w:docDefaults>
-  <w:style w:type="paragraph" w:styleId="Title">
-    <w:name w:val="Title"/>
-    <w:basedOn w:val="Normal"/>
-    <w:next w:val="Normal"/>
+  <w:latentStyles w:defLockedState="0" w:defUIPriority="99" w:defSemiHidden="0" w:defUnhideWhenUsed="0" w:defQFormat="0" w:count="372">
+    <w:lsdException w:name="Normal" w:uiPriority="0" w:qFormat="1"/>
+    <w:lsdException w:name="heading 1" w:uiPriority="9" w:qFormat="1"/>
+    <w:lsdException w:name="heading 2" w:semiHidden="1" w:uiPriority="9" w:unhideWhenUsed="1" w:qFormat="1"/>
+    <w:lsdException w:name="heading 3" w:semiHidden="1" w:uiPriority="9" w:unhideWhenUsed="1" w:qFormat="1"/>
+    <w:lsdException w:name="heading 4" w:semiHidden="1" w:uiPriority="9" w:unhideWhenUsed="1" w:qFormat="1"/>
+    <w:lsdException w:name="heading 5" w:semiHidden="1" w:uiPriority="9" w:unhideWhenUsed="1" w:qFormat="1"/>
+    <w:lsdException w:name="heading 6" w:semiHidden="1" w:uiPriority="9" w:unhideWhenUsed="1" w:qFormat="1"/>
+    <w:lsdException w:name="heading 7" w:semiHidden="1" w:uiPriority="9" w:unhideWhenUsed="1" w:qFormat="1"/>
+    <w:lsdException w:name="heading 8" w:semiHidden="1" w:uiPriority="9" w:unhideWhenUsed="1" w:qFormat="1"/>
+    <w:lsdException w:name="heading 9" w:semiHidden="1" w:uiPriority="9" w:unhideWhenUsed="1" w:qFormat="1"/>
+    <w:lsdException w:name="index 1" w:semiHidden="1" w:unhideWhenUsed="1"/>
+    <w:lsdException w:name="index 2" w:semiHidden="1" w:unhideWhenUsed="1"/>
+    <w:lsdException w:name="index 3" w:semiHidden="1" w:unhideWhenUsed="1"/>
+    <w:lsdException w:name="index 4" w:semiHidden="1" w:unhideWhenUsed="1"/>
+    <w:lsdException w:name="index 5" w:semiHidden="1" w:unhideWhenUsed="1"/>
+    <w:lsdException w:name="index 6" w:semiHidden="1" w:unhideWhenUsed="1"/>
+    <w:lsdException w:name="index 7" w:semiHidden="1" w:unhideWhenUsed="1"/>
+    <w:lsdException w:name="index 8" w:semiHidden="1" w:unhideWhenUsed="1"/>
+    <w:lsdException w:name="index 9" w:semiHidden="1" w:unhideWhenUsed="1"/>
+    <w:lsdException w:name="toc 1" w:semiHidden="1" w:uiPriority="39" w:unhideWhenUsed="1"/>
+    <w:lsdException w:name="toc 2" w:semiHidden="1" w:uiPriority="39" w:unhideWhenUsed="1"/>
+    <w:lsdException w:name="toc 3" w:semiHidden="1" w:uiPriority="39" w:unhideWhenUsed="1"/>
+    <w:lsdException w:name="toc 4" w:semiHidden="1" w:uiPriority="39" w:unhideWhenUsed="1"/>
+    <w:lsdException w:name="toc 5" w:semiHidden="1" w:uiPriority="39" w:unhideWhenUsed="1"/>
+    <w:lsdException w:name="toc 6" w:semiHidden="1" w:uiPriority="39" w:unhideWhenUsed="1"/>
+    <w:lsdException w:name="toc 7" w:semiHidden="1" w:uiPriority="39" w:unhideWhenUsed="1"/>
+    <w:lsdException w:name="toc 8" w:semiHidden="1" w:uiPriority="39" w:unhideWhenUsed="1"/>
+    <w:lsdException w:name="toc 9" w:semiHidden="1" w:uiPriority="39" w:unhideWhenUsed="1"/>
+    <w:lsdException w:name="Normal Indent" w:semiHidden="1" w:unhideWhenUsed="1"/>
+    <w:lsdException w:name="footnote text" w:semiHidden="1" w:unhideWhenUsed="1"/>
+    <w:lsdException w:name="annotation text" w:semiHidden="1" w:unhideWhenUsed="1"/>
+    <w:lsdException w:name="header" w:semiHidden="1" w:unhideWhenUsed="1"/>
+    <w:lsdException w:name="footer" w:semiHidden="1" w:unhideWhenUsed="1"/>
+    <w:lsdException w:name="index heading" w:semiHidden="1" w:unhideWhenUsed="1"/>
+    <w:lsdException w:name="caption" w:semiHidden="1" w:uiPriority="35" w:unhideWhenUsed="1" w:qFormat="1"/>
+    <w:lsdException w:name="table of figures" w:semiHidden="1" w:unhideWhenUsed="1"/>
+    <w:lsdException w:name="envelope address" w:semiHidden="1" w:unhideWhenUsed="1"/>
+    <w:lsdException w:name="envelope return" w:semiHidden="1" w:unhideWhenUsed="1"/>
+    <w:lsdException w:name="footnote reference" w:semiHidden="1" w:unhideWhenUsed="1"/>
+    <w:lsdException w:name="annotation reference" w:semiHidden="1" w:unhideWhenUsed="1"/>
+    <w:lsdException w:name="line number" w:semiHidden="1" w:unhideWhenUsed="1"/>
+    <w:lsdException w:name="page number" w:semiHidden="1" w:unhideWhenUsed="1"/>
+    <w:lsdException w:name="endnote reference" w:semiHidden="1" w:unhideWhenUsed="1"/>
+    <w:lsdException w:name="endnote text" w:semiHidden="1" w:unhideWhenUsed="1"/>
+    <w:lsdException w:name="table of authorities" w:semiHidden="1" w:unhideWhenUsed="1"/>
+    <w:lsdException w:name="macro" w:semiHidden="1" w:unhideWhenUsed="1"/>
+    <w:lsdException w:name="toa heading" w:semiHidden="1" w:unhideWhenUsed="1"/>
+    <w:lsdException w:name="List" w:semiHidden="1" w:unhideWhenUsed="1"/>
+    <w:lsdException w:name="List Bullet" w:semiHidden="1" w:unhideWhenUsed="1"/>
+    <w:lsdException w:name="List Number" w:semiHidden="1" w:unhideWhenUsed="1"/>
+    <w:lsdException w:name="List 2" w:semiHidden="1" w:unhideWhenUsed="1"/>
+    <w:lsdException w:name="List 3" w:semiHidden="1" w:unhideWhenUsed="1"/>
+    <w:lsdException w:name="List 4" w:semiHidden="1" w:unhideWhenUsed="1"/>
+    <w:lsdException w:name="List 5" w:semiHidden="1" w:unhideWhenUsed="1"/>
+    <w:lsdException w:name="List Bullet 2" w:semiHidden="1" w:unhideWhenUsed="1"/>
+    <w:lsdException w:name="List Bullet 3" w:semiHidden="1" w:unhideWhenUsed="1"/>
+    <w:lsdException w:name="List Bullet 4" w:semiHidden="1" w:unhideWhenUsed="1"/>
+    <w:lsdException w:name="List Bullet 5" w:semiHidden="1" w:unhideWhenUsed="1"/>
+    <w:lsdException w:name="List Number 2" w:semiHidden="1" w:unhideWhenUsed="1"/>
+    <w:lsdException w:name="List Number 3" w:semiHidden="1" w:unhideWhenUsed="1"/>
+    <w:lsdException w:name="List Number 4" w:semiHidden="1" w:unhideWhenUsed="1"/>
+    <w:lsdException w:name="List Number 5" w:semiHidden="1" w:unhideWhenUsed="1"/>
+    <w:lsdException w:name="Title" w:uiPriority="10" w:qFormat="1"/>
+    <w:lsdException w:name="Closing" w:semiHidden="1" w:unhideWhenUsed="1"/>
+    <w:lsdException w:name="Signature" w:semiHidden="1" w:unhideWhenUsed="1"/>
+    <w:lsdException w:name="Default Paragraph Font" w:semiHidden="1" w:uiPriority="1" w:unhideWhenUsed="1"/>
+    <w:lsdException w:name="Body Text" w:semiHidden="1" w:unhideWhenUsed="1"/>
+    <w:lsdException w:name="Body Text Indent" w:semiHidden="1" w:unhideWhenUsed="1"/>
+    <w:lsdException w:name="List Continue" w:semiHidden="1" w:unhideWhenUsed="1"/>
+    <w:lsdException w:name="List Continue 2" w:semiHidden="1" w:unhideWhenUsed="1"/>
+    <w:lsdException w:name="List Continue 3" w:semiHidden="1" w:unhideWhenUsed="1"/>
+    <w:lsdException w:name="List Continue 4" w:semiHidden="1" w:unhideWhenUsed="1"/>
+    <w:lsdException w:name="List Continue 5" w:semiHidden="1" w:unhideWhenUsed="1"/>
+    <w:lsdException w:name="Message Header" w:semiHidden="1" w:unhideWhenUsed="1"/>
+    <w:lsdException w:name="Subtitle" w:uiPriority="11" w:qFormat="1"/>
+    <w:lsdException w:name="Salutation" w:semiHidden="1" w:unhideWhenUsed="1"/>
+    <w:lsdException w:name="Date" w:semiHidden="1" w:unhideWhenUsed="1"/>
+    <w:lsdException w:name="Body Text First Indent" w:semiHidden="1" w:unhideWhenUsed="1"/>
+    <w:lsdException w:name="Body Text First Indent 2" w:semiHidden="1" w:unhideWhenUsed="1"/>
+    <w:lsdException w:name="Note Heading" w:semiHidden="1" w:unhideWhenUsed="1"/>
+    <w:lsdException w:name="Body Text 2" w:semiHidden="1" w:unhideWhenUsed="1"/>
+    <w:lsdException w:name="Body Text 3" w:semiHidden="1" w:unhideWhenUsed="1"/>
+    <w:lsdException w:name="Body Text Indent 2" w:semiHidden="1" w:unhideWhenUsed="1"/>
+    <w:lsdException w:name="Body Text Indent 3" w:semiHidden="1" w:unhideWhenUsed="1"/>
+    <w:lsdException w:name="Block Text" w:semiHidden="1" w:unhideWhenUsed="1"/>
+    <w:lsdException w:name="Hyperlink" w:semiHidden="1" w:unhideWhenUsed="1"/>
+    <w:lsdException w:name="FollowedHyperlink" w:semiHidden="1" w:unhideWhenUsed="1"/>
+    <w:lsdException w:name="Strong" w:uiPriority="22" w:qFormat="1"/>
+    <w:lsdException w:name="Emphasis" w:uiPriority="20" w:qFormat="1"/>
+    <w:lsdException w:name="Document Map" w:semiHidden="1" w:unhideWhenUsed="1"/>
+    <w:lsdException w:name="Plain Text" w:semiHidden="1" w:unhideWhenUsed="1"/>
+    <w:lsdException w:name="E-mail Signature" w:semiHidden="1" w:unhideWhenUsed="1"/>
+    <w:lsdException w:name="HTML Top of Form" w:semiHidden="1" w:unhideWhenUsed="1"/>
+    <w:lsdException w:name="HTML Bottom of Form" w:semiHidden="1" w:unhideWhenUsed="1"/>
+    <w:lsdException w:name="Normal (Web)" w:semiHidden="1" w:unhideWhenUsed="1"/>
+    <w:lsdException w:name="HTML Acronym" w:semiHidden="1" w:unhideWhenUsed="1"/>
+    <w:lsdException w:name="HTML Address" w:semiHidden="1" w:unhideWhenUsed="1"/>
+    <w:lsdException w:name="HTML Cite" w:semiHidden="1" w:unhideWhenUsed="1"/>
+    <w:lsdException w:name="HTML Code" w:semiHidden="1" w:unhideWhenUsed="1"/>
+    <w:lsdException w:name="HTML Definition" w:semiHidden="1" w:unhideWhenUsed="1"/>
+    <w:lsdException w:name="HTML Keyboard" w:semiHidden="1" w:unhideWhenUsed="1"/>
+    <w:lsdException w:name="HTML Preformatted" w:semiHidden="1" w:unhideWhenUsed="1"/>
+    <w:lsdException w:name="HTML Sample" w:semiHidden="1" w:unhideWhenUsed="1"/>
+    <w:lsdException w:name="HTML Typewriter" w:semiHidden="1" w:unhideWhenUsed="1"/>
+    <w:lsdException w:name="HTML Variable" w:semiHidden="1" w:unhideWhenUsed="1"/>
+    <w:lsdException w:name="Normal Table" w:semiHidden="1" w:unhideWhenUsed="1"/>
+    <w:lsdException w:name="annotation subject" w:semiHidden="1" w:unhideWhenUsed="1"/>
+    <w:lsdException w:name="No List" w:semiHidden="1" w:unhideWhenUsed="1"/>
+    <w:lsdException w:name="Outline List 1" w:semiHidden="1" w:unhideWhenUsed="1"/>
+    <w:lsdException w:name="Outline List 2" w:semiHidden="1" w:unhideWhenUsed="1"/>
+    <w:lsdException w:name="Outline List 3" w:semiHidden="1" w:unhideWhenUsed="1"/>
+    <w:lsdException w:name="Table Simple 1" w:semiHidden="1" w:unhideWhenUsed="1"/>
+    <w:lsdException w:name="Table Simple 2" w:semiHidden="1" w:unhideWhenUsed="1"/>
+    <w:lsdException w:name="Table Simple 3" w:semiHidden="1" w:unhideWhenUsed="1"/>
+    <w:lsdException w:name="Table Classic 1" w:semiHidden="1" w:unhideWhenUsed="1"/>
+    <w:lsdException w:name="Table Classic 2" w:semiHidden="1" w:unhideWhenUsed="1"/>
+    <w:lsdException w:name="Table Classic 3" w:semiHidden="1" w:unhideWhenUsed="1"/>
+    <w:lsdException w:name="Table Classic 4" w:semiHidden="1" w:unhideWhenUsed="1"/>
+    <w:lsdException w:name="Table Colorful 1" w:semiHidden="1" w:unhideWhenUsed="1"/>
+    <w:lsdException w:name="Table Colorful 2" w:semiHidden="1" w:unhideWhenUsed="1"/>
+    <w:lsdException w:name="Table Colorful 3" w:semiHidden="1" w:unhideWhenUsed="1"/>
+    <w:lsdException w:name="Table Columns 1" w:semiHidden="1" w:unhideWhenUsed="1"/>
+    <w:lsdException w:name="Table Columns 2" w:semiHidden="1" w:unhideWhenUsed="1"/>
+    <w:lsdException w:name="Table Columns 3" w:semiHidden="1" w:unhideWhenUsed="1"/>
+    <w:lsdException w:name="Table Columns 4" w:semiHidden="1" w:unhideWhenUsed="1"/>
+    <w:lsdException w:name="Table Columns 5" w:semiHidden="1" w:unhideWhenUsed="1"/>
+    <w:lsdException w:name="Table Grid 1" w:semiHidden="1" w:unhideWhenUsed="1"/>
+    <w:lsdException w:name="Table Grid 2" w:semiHidden="1" w:unhideWhenUsed="1"/>
+    <w:lsdException w:name="Table Grid 3" w:semiHidden="1" w:unhideWhenUsed="1"/>
+    <w:lsdException w:name="Table Grid 4" w:semiHidden="1" w:unhideWhenUsed="1"/>
+    <w:lsdException w:name="Table Grid 5" w:semiHidden="1" w:unhideWhenUsed="1"/>
+    <w:lsdException w:name="Table Grid 6" w:semiHidden="1" w:unhideWhenUsed="1"/>
+    <w:lsdException w:name="Table Grid 7" w:semiHidden="1" w:unhideWhenUsed="1"/>
+    <w:lsdException w:name="Table Grid 8" w:semiHidden="1" w:unhideWhenUsed="1"/>
+    <w:lsdException w:name="Table List 1" w:semiHidden="1" w:unhideWhenUsed="1"/>
+    <w:lsdException w:name="Table List 2" w:semiHidden="1" w:unhideWhenUsed="1"/>
+    <w:lsdException w:name="Table List 3" w:semiHidden="1" w:unhideWhenUsed="1"/>
+    <w:lsdException w:name="Table List 4" w:semiHidden="1" w:unhideWhenUsed="1"/>
+    <w:lsdException w:name="Table List 5" w:semiHidden="1" w:unhideWhenUsed="1"/>
+    <w:lsdException w:name="Table List 6" w:semiHidden="1" w:unhideWhenUsed="1"/>
+    <w:lsdException w:name="Table List 7" w:semiHidden="1" w:unhideWhenUsed="1"/>
+    <w:lsdException w:name="Table List 8" w:semiHidden="1" w:unhideWhenUsed="1"/>
+    <w:lsdException w:name="Table 3D effects 1" w:semiHidden="1" w:unhideWhenUsed="1"/>
+    <w:lsdException w:name="Table 3D effects 2" w:semiHidden="1" w:unhideWhenUsed="1"/>
+    <w:lsdException w:name="Table 3D effects 3" w:semiHidden="1" w:unhideWhenUsed="1"/>
+    <w:lsdException w:name="Table Contemporary" w:semiHidden="1" w:unhideWhenUsed="1"/>
+    <w:lsdException w:name="Table Elegant" w:semiHidden="1" w:unhideWhenUsed="1"/>
+    <w:lsdException w:name="Table Professional" w:semiHidden="1" w:unhideWhenUsed="1"/>
+    <w:lsdException w:name="Table Subtle 1" w:semiHidden="1" w:unhideWhenUsed="1"/>
+    <w:lsdException w:name="Table Subtle 2" w:semiHidden="1" w:unhideWhenUsed="1"/>
+    <w:lsdException w:name="Table Web 1" w:semiHidden="1" w:unhideWhenUsed="1"/>
+    <w:lsdException w:name="Table Web 2" w:semiHidden="1" w:unhideWhenUsed="1"/>
+    <w:lsdException w:name="Table Web 3" w:semiHidden="1" w:unhideWhenUsed="1"/>
+    <w:lsdException w:name="Balloon Text" w:semiHidden="1" w:unhideWhenUsed="1"/>
+    <w:lsdException w:name="Table Grid" w:uiPriority="39"/>
+    <w:lsdException w:name="Table Theme" w:semiHidden="1" w:unhideWhenUsed="1"/>
+    <w:lsdException w:name="Placeholder Text" w:semiHidden="1"/>
+    <w:lsdException w:name="No Spacing" w:uiPriority="1" w:qFormat="1"/>
+    <w:lsdException w:name="Light Shading" w:uiPriority="60"/>
+    <w:lsdException w:name="Light List" w:uiPriority="61"/>
+    <w:lsdException w:name="Light Grid" w:uiPriority="62"/>
+    <w:lsdException w:name="Medium Shading 1" w:uiPriority="63"/>
+    <w:lsdException w:name="Medium Shading 2" w:uiPriority="64"/>
+    <w:lsdException w:name="Medium List 1" w:uiPriority="65"/>
+    <w:lsdException w:name="Medium List 2" w:uiPriority="66"/>
+    <w:lsdException w:name="Medium Grid 1" w:uiPriority="67"/>
+    <w:lsdException w:name="Medium Grid 2" w:uiPriority="68"/>
+    <w:lsdException w:name="Medium Grid 3" w:uiPriority="69"/>
+    <w:lsdException w:name="Dark List" w:uiPriority="70"/>
+    <w:lsdException w:name="Colorful Shading" w:uiPriority="71"/>
+    <w:lsdException w:name="Colorful List" w:uiPriority="72"/>
+    <w:lsdException w:name="Colorful Grid" w:uiPriority="73"/>
+    <w:lsdException w:name="Light Shading Accent 1" w:uiPriority="60"/>
+    <w:lsdException w:name="Light List Accent 1" w:uiPriority="61"/>
+    <w:lsdException w:name="Light Grid Accent 1" w:uiPriority="62"/>
+    <w:lsdException w:name="Medium Shading 1 Accent 1" w:uiPriority="63"/>
+    <w:lsdException w:name="Medium Shading 2 Accent 1" w:uiPriority="64"/>
+    <w:lsdException w:name="Medium List 1 Accent 1" w:uiPriority="65"/>
+    <w:lsdException w:name="Revision" w:semiHidden="1"/>
+    <w:lsdException w:name="List Paragraph" w:uiPriority="34" w:qFormat="1"/>
+    <w:lsdException w:name="Quote" w:uiPriority="29" w:qFormat="1"/>
+    <w:lsdException w:name="Intense Quote" w:uiPriority="30" w:qFormat="1"/>
+    <w:lsdException w:name="Medium List 2 Accent 1" w:uiPriority="66"/>
+    <w:lsdException w:name="Medium Grid 1 Accent 1" w:uiPriority="67"/>
+    <w:lsdException w:name="Medium Grid 2 Accent 1" w:uiPriority="68"/>
+    <w:lsdException w:name="Medium Grid 3 Accent 1" w:uiPriority="69"/>
+    <w:lsdException w:name="Dark List Accent 1" w:uiPriority="70"/>
+    <w:lsdException w:name="Colorful Shading Accent 1" w:uiPriority="71"/>
+    <w:lsdException w:name="Colorful List Accent 1" w:uiPriority="72"/>
+    <w:lsdException w:name="Colorful Grid Accent 1" w:uiPriority="73"/>
+    <w:lsdException w:name="Light Shading Accent 2" w:uiPriority="60"/>
+    <w:lsdException w:name="Light List Accent 2" w:uiPriority="61"/>
+    <w:lsdException w:name="Light Grid Accent 2" w:uiPriority="62"/>
+    <w:lsdException w:name="Medium Shading 1 Accent 2" w:uiPriority="63"/>
+    <w:lsdException w:name="Medium Shading 2 Accent 2" w:uiPriority="64"/>
+    <w:lsdException w:name="Medium List 1 Accent 2" w:uiPriority="65"/>
+    <w:lsdException w:name="Medium List 2 Accent 2" w:uiPriority="66"/>
+    <w:lsdException w:name="Medium Grid 1 Accent 2" w:uiPriority="67"/>
+    <w:lsdException w:name="Medium Grid 2 Accent 2" w:uiPriority="68"/>
+    <w:lsdException w:name="Medium Grid 3 Accent 2" w:uiPriority="69"/>
+    <w:lsdException w:name="Dark List Accent 2" w:uiPriority="70"/>
+    <w:lsdException w:name="Colorful Shading Accent 2" w:uiPriority="71"/>
+    <w:lsdException w:name="Colorful List Accent 2" w:uiPriority="72"/>
+    <w:lsdException w:name="Colorful Grid Accent 2" w:uiPriority="73"/>
+    <w:lsdException w:name="Light Shading Accent 3" w:uiPriority="60"/>
+    <w:lsdException w:name="Light List Accent 3" w:uiPriority="61"/>
+    <w:lsdException w:name="Light Grid Accent 3" w:uiPriority="62"/>
+    <w:lsdException w:name="Medium Shading 1 Accent 3" w:uiPriority="63"/>
+    <w:lsdException w:name="Medium Shading 2 Accent 3" w:uiPriority="64"/>
+    <w:lsdException w:name="Medium List 1 Accent 3" w:uiPriority="65"/>
+    <w:lsdException w:name="Medium List 2 Accent 3" w:uiPriority="66"/>
+    <w:lsdException w:name="Medium Grid 1 Accent 3" w:uiPriority="67"/>
+    <w:lsdException w:name="Medium Grid 2 Accent 3" w:uiPriority="68"/>
+    <w:lsdException w:name="Medium Grid 3 Accent 3" w:uiPriority="69"/>
+    <w:lsdException w:name="Dark List Accent 3" w:uiPriority="70"/>
+    <w:lsdException w:name="Colorful Shading Accent 3" w:uiPriority="71"/>
+    <w:lsdException w:name="Colorful List Accent 3" w:uiPriority="72"/>
+    <w:lsdException w:name="Colorful Grid Accent 3" w:uiPriority="73"/>
+    <w:lsdException w:name="Light Shading Accent 4" w:uiPriority="60"/>
+    <w:lsdException w:name="Light List Accent 4" w:uiPriority="61"/>
+    <w:lsdException w:name="Light Grid Accent 4" w:uiPriority="62"/>
+    <w:lsdException w:name="Medium Shading 1 Accent 4" w:uiPriority="63"/>
+    <w:lsdException w:name="Medium Shading 2 Accent 4" w:uiPriority="64"/>
+    <w:lsdException w:name="Medium List 1 Accent 4" w:uiPriority="65"/>
+    <w:lsdException w:name="Medium List 2 Accent 4" w:uiPriority="66"/>
+    <w:lsdException w:name="Medium Grid 1 Accent 4" w:uiPriority="67"/>
+    <w:lsdException w:name="Medium Grid 2 Accent 4" w:uiPriority="68"/>
+    <w:lsdException w:name="Medium Grid 3 Accent 4" w:uiPriority="69"/>
+    <w:lsdException w:name="Dark List Accent 4" w:uiPriority="70"/>
+    <w:lsdException w:name="Colorful Shading Accent 4" w:uiPriority="71"/>
+    <w:lsdException w:name="Colorful List Accent 4" w:uiPriority="72"/>
+    <w:lsdException w:name="Colorful Grid Accent 4" w:uiPriority="73"/>
+    <w:lsdException w:name="Light Shading Accent 5" w:uiPriority="60"/>
+    <w:lsdException w:name="Light List Accent 5" w:uiPriority="61"/>
+    <w:lsdException w:name="Light Grid Accent 5" w:uiPriority="62"/>
+    <w:lsdException w:name="Medium Shading 1 Accent 5" w:uiPriority="63"/>
+    <w:lsdException w:name="Medium Shading 2 Accent 5" w:uiPriority="64"/>
+    <w:lsdException w:name="Medium List 1 Accent 5" w:uiPriority="65"/>
+    <w:lsdException w:name="Medium List 2 Accent 5" w:uiPriority="66"/>
+    <w:lsdException w:name="Medium Grid 1 Accent 5" w:uiPriority="67"/>
+    <w:lsdException w:name="Medium Grid 2 Accent 5" w:uiPriority="68"/>
+    <w:lsdException w:name="Medium Grid 3 Accent 5" w:uiPriority="69"/>
+    <w:lsdException w:name="Dark List Accent 5" w:uiPriority="70"/>
+    <w:lsdException w:name="Colorful Shading Accent 5" w:uiPriority="71"/>
+    <w:lsdException w:name="Colorful List Accent 5" w:uiPriority="72"/>
+    <w:lsdException w:name="Colorful Grid Accent 5" w:uiPriority="73"/>
+    <w:lsdException w:name="Light Shading Accent 6" w:uiPriority="60"/>
+    <w:lsdException w:name="Light List Accent 6" w:uiPriority="61"/>
+    <w:lsdException w:name="Light Grid Accent 6" w:uiPriority="62"/>
+    <w:lsdException w:name="Medium Shading 1 Accent 6" w:uiPriority="63"/>
+    <w:lsdException w:name="Medium Shading 2 Accent 6" w:uiPriority="64"/>
+    <w:lsdException w:name="Medium List 1 Accent 6" w:uiPriority="65"/>
+    <w:lsdException w:name="Medium List 2 Accent 6" w:uiPriority="66"/>
+    <w:lsdException w:name="Medium Grid 1 Accent 6" w:uiPriority="67"/>
+    <w:lsdException w:name="Medium Grid 2 Accent 6" w:uiPriority="68"/>
+    <w:lsdException w:name="Medium Grid 3 Accent 6" w:uiPriority="69"/>
+    <w:lsdException w:name="Dark List Accent 6" w:uiPriority="70"/>
+    <w:lsdException w:name="Colorful Shading Accent 6" w:uiPriority="71"/>
+    <w:lsdException w:name="Colorful List Accent 6" w:uiPriority="72"/>
+    <w:lsdException w:name="Colorful Grid Accent 6" w:uiPriority="73"/>
+    <w:lsdException w:name="Subtle Emphasis" w:uiPriority="19" w:qFormat="1"/>
+    <w:lsdException w:name="Intense Emphasis" w:uiPriority="21" w:qFormat="1"/>
+    <w:lsdException w:name="Subtle Reference" w:uiPriority="31" w:qFormat="1"/>
+    <w:lsdException w:name="Intense Reference" w:uiPriority="32" w:qFormat="1"/>
+    <w:lsdException w:name="Book Title" w:uiPriority="33" w:qFormat="1"/>
+    <w:lsdException w:name="Bibliography" w:semiHidden="1" w:uiPriority="37" w:unhideWhenUsed="1"/>
+    <w:lsdException w:name="TOC Heading" w:semiHidden="1" w:uiPriority="39" w:unhideWhenUsed="1" w:qFormat="1"/>
+    <w:lsdException w:name="Plain Table 1" w:uiPriority="41"/>
+    <w:lsdException w:name="Plain Table 2" w:uiPriority="42"/>
+    <w:lsdException w:name="Plain Table 3" w:uiPriority="43"/>
+    <w:lsdException w:name="Plain Table 4" w:uiPriority="44"/>
+    <w:lsdException w:name="Plain Table 5" w:uiPriority="45"/>
+    <w:lsdException w:name="Grid Table Light" w:uiPriority="40"/>
+    <w:lsdException w:name="Grid Table 1 Light" w:uiPriority="46"/>
+    <w:lsdException w:name="Grid Table 2" w:uiPriority="47"/>
+    <w:lsdException w:name="Grid Table 3" w:uiPriority="48"/>
+    <w:lsdException w:name="Grid Table 4" w:uiPriority="49"/>
+    <w:lsdException w:name="Grid Table 5 Dark" w:uiPriority="50"/>
+    <w:lsdException w:name="Grid Table 6 Colorful" w:uiPriority="51"/>
+    <w:lsdException w:name="Grid Table 7 Colorful" w:uiPriority="52"/>
+    <w:lsdException w:name="Grid Table 1 Light Accent 1" w:uiPriority="46"/>
+    <w:lsdException w:name="Grid Table 2 Accent 1" w:uiPriority="47"/>
+    <w:lsdException w:name="Grid Table 3 Accent 1" w:uiPriority="48"/>
+    <w:lsdException w:name="Grid Table 4 Accent 1" w:uiPriority="49"/>
+    <w:lsdException w:name="Grid Table 5 Dark Accent 1" w:uiPriority="50"/>
+    <w:lsdException w:name="Grid Table 6 Colorful Accent 1" w:uiPriority="51"/>
+    <w:lsdException w:name="Grid Table 7 Colorful Accent 1" w:uiPriority="52"/>
+    <w:lsdException w:name="Grid Table 1 Light Accent 2" w:uiPriority="46"/>
+    <w:lsdException w:name="Grid Table 2 Accent 2" w:uiPriority="47"/>
+    <w:lsdException w:name="Grid Table 3 Accent 2" w:uiPriority="48"/>
+    <w:lsdException w:name="Grid Table 4 Accent 2" w:uiPriority="49"/>
+    <w:lsdException w:name="Grid Table 5 Dark Accent 2" w:uiPriority="50"/>
+    <w:lsdException w:name="Grid Table 6 Colorful Accent 2" w:uiPriority="51"/>
+    <w:lsdException w:name="Grid Table 7 Colorful Accent 2" w:uiPriority="52"/>
+    <w:lsdException w:name="Grid Table 1 Light Accent 3" w:uiPriority="46"/>
+    <w:lsdException w:name="Grid Table 2 Accent 3" w:uiPriority="47"/>
+    <w:lsdException w:name="Grid Table 3 Accent 3" w:uiPriority="48"/>
+    <w:lsdException w:name="Grid Table 4 Accent 3" w:uiPriority="49"/>
+    <w:lsdException w:name="Grid Table 5 Dark Accent 3" w:uiPriority="50"/>
+    <w:lsdException w:name="Grid Table 6 Colorful Accent 3" w:uiPriority="51"/>
+    <w:lsdException w:name="Grid Table 7 Colorful Accent 3" w:uiPriority="52"/>
+    <w:lsdException w:name="Grid Table 1 Light Accent 4" w:uiPriority="46"/>
+    <w:lsdException w:name="Grid Table 2 Accent 4" w:uiPriority="47"/>
+    <w:lsdException w:name="Grid Table 3 Accent 4" w:uiPriority="48"/>
+    <w:lsdException w:name="Grid Table 4 Accent 4" w:uiPriority="49"/>
+    <w:lsdException w:name="Grid Table 5 Dark Accent 4" w:uiPriority="50"/>
+    <w:lsdException w:name="Grid Table 6 Colorful Accent 4" w:uiPriority="51"/>
+    <w:lsdException w:name="Grid Table 7 Colorful Accent 4" w:uiPriority="52"/>
+    <w:lsdException w:name="Grid Table 1 Light Accent 5" w:uiPriority="46"/>
+    <w:lsdException w:name="Grid Table 2 Accent 5" w:uiPriority="47"/>
+    <w:lsdException w:name="Grid Table 3 Accent 5" w:uiPriority="48"/>
+    <w:lsdException w:name="Grid Table 4 Accent 5" w:uiPriority="49"/>
+    <w:lsdException w:name="Grid Table 5 Dark Accent 5" w:uiPriority="50"/>
+    <w:lsdException w:name="Grid Table 6 Colorful Accent 5" w:uiPriority="51"/>
+    <w:lsdException w:name="Grid Table 7 Colorful Accent 5" w:uiPriority="52"/>
+    <w:lsdException w:name="Grid Table 1 Light Accent 6" w:uiPriority="46"/>
+    <w:lsdException w:name="Grid Table 2 Accent 6" w:uiPriority="47"/>
+    <w:lsdException w:name="Grid Table 3 Accent 6" w:uiPriority="48"/>
+    <w:lsdException w:name="Grid Table 4 Accent 6" w:uiPriority="49"/>
+    <w:lsdException w:name="Grid Table 5 Dark Accent 6" w:uiPriority="50"/>
+    <w:lsdException w:name="Grid Table 6 Colorful Accent 6" w:uiPriority="51"/>
+    <w:lsdException w:name="Grid Table 7 Colorful Accent 6" w:uiPriority="52"/>
+    <w:lsdException w:name="List Table 1 Light" w:uiPriority="46"/>
+    <w:lsdException w:name="List Table 2" w:uiPriority="47"/>
+    <w:lsdException w:name="List Table 3" w:uiPriority="48"/>
+    <w:lsdException w:name="List Table 4" w:uiPriority="49"/>
+    <w:lsdException w:name="List Table 5 Dark" w:uiPriority="50"/>
+    <w:lsdException w:name="List Table 6 Colorful" w:uiPriority="51"/>
+    <w:lsdException w:name="List Table 7 Colorful" w:uiPriority="52"/>
+    <w:lsdException w:name="List Table 1 Light Accent 1" w:uiPriority="46"/>
+    <w:lsdException w:name="List Table 2 Accent 1" w:uiPriority="47"/>
+    <w:lsdException w:name="List Table 3 Accent 1" w:uiPriority="48"/>
+    <w:lsdException w:name="List Table 4 Accent 1" w:uiPriority="49"/>
+    <w:lsdException w:name="List Table 5 Dark Accent 1" w:uiPriority="50"/>
+    <w:lsdException w:name="List Table 6 Colorful Accent 1" w:uiPriority="51"/>
+    <w:lsdException w:name="List Table 7 Colorful Accent 1" w:uiPriority="52"/>
+    <w:lsdException w:name="List Table 1 Light Accent 2" w:uiPriority="46"/>
+    <w:lsdException w:name="List Table 2 Accent 2" w:uiPriority="47"/>
+    <w:lsdException w:name="List Table 3 Accent 2" w:uiPriority="48"/>
+    <w:lsdException w:name="List Table 4 Accent 2" w:uiPriority="49"/>
+    <w:lsdException w:name="List Table 5 Dark Accent 2" w:uiPriority="50"/>
+    <w:lsdException w:name="List Table 6 Colorful Accent 2" w:uiPriority="51"/>
+    <w:lsdException w:name="List Table 7 Colorful Accent 2" w:uiPriority="52"/>
+    <w:lsdException w:name="List Table 1 Light Accent 3" w:uiPriority="46"/>
+    <w:lsdException w:name="List Table 2 Accent 3" w:uiPriority="47"/>
+    <w:lsdException w:name="List Table 3 Accent 3" w:uiPriority="48"/>
+    <w:lsdException w:name="List Table 4 Accent 3" w:uiPriority="49"/>
+    <w:lsdException w:name="List Table 5 Dark Accent 3" w:uiPriority="50"/>
+    <w:lsdException w:name="List Table 6 Colorful Accent 3" w:uiPriority="51"/>
+    <w:lsdException w:name="List Table 7 Colorful Accent 3" w:uiPriority="52"/>
+    <w:lsdException w:name="List Table 1 Light Accent 4" w:uiPriority="46"/>
+    <w:lsdException w:name="List Table 2 Accent 4" w:uiPriority="47"/>
+    <w:lsdException w:name="List Table 3 Accent 4" w:uiPriority="48"/>
+    <w:lsdException w:name="List Table 4 Accent 4" w:uiPriority="49"/>
+    <w:lsdException w:name="List Table 5 Dark Accent 4" w:uiPriority="50"/>
+    <w:lsdException w:name="List Table 6 Colorful Accent 4" w:uiPriority="51"/>
+    <w:lsdException w:name="List Table 7 Colorful Accent 4" w:uiPriority="52"/>
+    <w:lsdException w:name="List Table 1 Light Accent 5" w:uiPriority="46"/>
+    <w:lsdException w:name="List Table 2 Accent 5" w:uiPriority="47"/>
+    <w:lsdException w:name="List Table 3 Accent 5" w:uiPriority="48"/>
+    <w:lsdException w:name="List Table 4 Accent 5" w:uiPriority="49"/>
+    <w:lsdException w:name="List Table 5 Dark Accent 5" w:uiPriority="50"/>
+    <w:lsdException w:name="List Table 6 Colorful Accent 5" w:uiPriority="51"/>
+    <w:lsdException w:name="List Table 7 Colorful Accent 5" w:uiPriority="52"/>
+    <w:lsdException w:name="List Table 1 Light Accent 6" w:uiPriority="46"/>
+    <w:lsdException w:name="List Table 2 Accent 6" w:uiPriority="47"/>
+    <w:lsdException w:name="List Table 3 Accent 6" w:uiPriority="48"/>
+    <w:lsdException w:name="List Table 4 Accent 6" w:uiPriority="49"/>
+    <w:lsdException w:name="List Table 5 Dark Accent 6" w:uiPriority="50"/>
+    <w:lsdException w:name="List Table 6 Colorful Accent 6" w:uiPriority="51"/>
+    <w:lsdException w:name="List Table 7 Colorful Accent 6" w:uiPriority="52"/>
+    <w:lsdException w:name="Mention" w:semiHidden="1" w:unhideWhenUsed="1"/>
+  </w:latentStyles>
+  <w:style w:type="paragraph" w:default="1" w:styleId="Normal">
+    <w:name w:val="Normal"/>
     <w:qFormat/>
-    <w:rPr>
-      <w:sz w:val="56"/>
-      <w:szCs w:val="56"/>
-    </w:rPr>
   </w:style>
   <w:style w:type="paragraph" w:styleId="Heading1">
-    <w:name w:val="Heading 1"/>
-    <w:basedOn w:val="Normal"/>
-    <w:next w:val="Normal"/>
+    <w:name w:val="heading 1"/>
     <w:qFormat/>
+    <w:pPr>
+      <w:outlineLvl w:val="0"/>
+    </w:pPr>
     <w:rPr>
       <w:color w:val="2E74B5"/>
       <w:sz w:val="32"/>
@@ -1214,10 +2310,11 @@
     </w:rPr>
   </w:style>
   <w:style w:type="paragraph" w:styleId="Heading2">
-    <w:name w:val="Heading 2"/>
-    <w:basedOn w:val="Normal"/>
-    <w:next w:val="Normal"/>
+    <w:name w:val="heading 2"/>
     <w:qFormat/>
+    <w:pPr>
+      <w:outlineLvl w:val="1"/>
+    </w:pPr>
     <w:rPr>
       <w:color w:val="2E74B5"/>
       <w:sz w:val="26"/>
@@ -1225,10 +2322,11 @@
     </w:rPr>
   </w:style>
   <w:style w:type="paragraph" w:styleId="Heading3">
-    <w:name w:val="Heading 3"/>
-    <w:basedOn w:val="Normal"/>
-    <w:next w:val="Normal"/>
+    <w:name w:val="heading 3"/>
     <w:qFormat/>
+    <w:pPr>
+      <w:outlineLvl w:val="2"/>
+    </w:pPr>
     <w:rPr>
       <w:color w:val="1F4D78"/>
       <w:sz w:val="24"/>
@@ -1236,10 +2334,11 @@
     </w:rPr>
   </w:style>
   <w:style w:type="paragraph" w:styleId="Heading4">
-    <w:name w:val="Heading 4"/>
-    <w:basedOn w:val="Normal"/>
-    <w:next w:val="Normal"/>
+    <w:name w:val="heading 4"/>
     <w:qFormat/>
+    <w:pPr>
+      <w:outlineLvl w:val="3"/>
+    </w:pPr>
     <w:rPr>
       <w:i/>
       <w:iCs/>
@@ -1247,27 +2346,65 @@
     </w:rPr>
   </w:style>
   <w:style w:type="paragraph" w:styleId="Heading5">
-    <w:name w:val="Heading 5"/>
-    <w:basedOn w:val="Normal"/>
-    <w:next w:val="Normal"/>
+    <w:name w:val="heading 5"/>
     <w:qFormat/>
+    <w:pPr>
+      <w:outlineLvl w:val="4"/>
+    </w:pPr>
     <w:rPr>
       <w:color w:val="2E74B5"/>
     </w:rPr>
   </w:style>
   <w:style w:type="paragraph" w:styleId="Heading6">
-    <w:name w:val="Heading 6"/>
-    <w:basedOn w:val="Normal"/>
-    <w:next w:val="Normal"/>
+    <w:name w:val="heading 6"/>
     <w:qFormat/>
+    <w:pPr>
+      <w:outlineLvl w:val="5"/>
+    </w:pPr>
     <w:rPr>
       <w:color w:val="1F4D78"/>
     </w:rPr>
   </w:style>
-  <w:style w:type="paragraph" w:styleId="Strong">
-    <w:name w:val="Strong"/>
-    <w:basedOn w:val="Normal"/>
-    <w:next w:val="Normal"/>
+  <w:style w:type="character" w:default="1" w:styleId="DefaultParagraphFont">
+    <w:name w:val="Default Paragraph Font"/>
+    <w:uiPriority w:val="1"/>
+    <w:semiHidden/>
+    <w:unhideWhenUsed/>
+  </w:style>
+  <w:style w:type="table" w:default="1" w:styleId="TableNormal">
+    <w:name w:val="Normal Table"/>
+    <w:uiPriority w:val="99"/>
+    <w:semiHidden/>
+    <w:unhideWhenUsed/>
+    <w:tblPr>
+      <w:tblInd w:w="0" w:type="dxa"/>
+      <w:tblCellMar>
+        <w:top w:w="0" w:type="dxa"/>
+        <w:left w:w="108" w:type="dxa"/>
+        <w:bottom w:w="0" w:type="dxa"/>
+        <w:right w:w="108" w:type="dxa"/>
+      </w:tblCellMar>
+    </w:tblPr>
+  </w:style>
+  <w:style w:type="numbering" w:default="1" w:styleId="NoList">
+    <w:name w:val="No List"/>
+    <w:uiPriority w:val="99"/>
+    <w:semiHidden/>
+    <w:unhideWhenUsed/>
+  </w:style>
+  <w:style w:type="paragraph" w:styleId="Title">
+    <w:name w:val="Title"/>
+    <w:pPr>
+      <w:spacing w:after="80"/>
+    </w:pPr>
+    <w:rPr>
+      <w:color w:val="2B6CB0"/>
+      <w:sz w:val="22"/>
+      <w:szCs w:val="22"/>
+    </w:rPr>
+  </w:style>
+  <w:style w:type="paragraph" w:customStyle="1" w:styleId="Strong1">
+    <w:name w:val="Strong1"/>
     <w:qFormat/>
     <w:rPr>
       <w:b/>
@@ -1276,12 +2413,10 @@
   </w:style>
   <w:style w:type="paragraph" w:styleId="ListParagraph">
     <w:name w:val="List Paragraph"/>
-    <w:basedOn w:val="Normal"/>
     <w:qFormat/>
   </w:style>
   <w:style w:type="character" w:styleId="Hyperlink">
     <w:name w:val="Hyperlink"/>
-    <w:basedOn w:val="DefaultParagraphFont"/>
     <w:uiPriority w:val="99"/>
     <w:unhideWhenUsed/>
     <w:rPr>
@@ -1291,7 +2426,6 @@
   </w:style>
   <w:style w:type="character" w:styleId="FootnoteReference">
     <w:name w:val="footnote reference"/>
-    <w:basedOn w:val="DefaultParagraphFont"/>
     <w:uiPriority w:val="99"/>
     <w:semiHidden/>
     <w:unhideWhenUsed/>
@@ -1301,22 +2435,13 @@
   </w:style>
   <w:style w:type="paragraph" w:styleId="FootnoteText">
     <w:name w:val="footnote text"/>
-    <w:basedOn w:val="Normal"/>
     <w:link w:val="FootnoteTextChar"/>
     <w:uiPriority w:val="99"/>
     <w:semiHidden/>
     <w:unhideWhenUsed/>
-    <w:pPr>
-      <w:spacing w:after="0" w:line="240" w:lineRule="auto"/>
-    </w:pPr>
-    <w:rPr>
-      <w:sz w:val="20"/>
-      <w:szCs w:val="20"/>
-    </w:rPr>
   </w:style>
-  <w:style w:type="character" w:styleId="FootnoteTextChar">
+  <w:style w:type="character" w:customStyle="1" w:styleId="FootnoteTextChar">
     <w:name w:val="Footnote Text Char"/>
-    <w:basedOn w:val="DefaultParagraphFont"/>
     <w:link w:val="FootnoteText"/>
     <w:uiPriority w:val="99"/>
     <w:semiHidden/>
@@ -1328,7 +2453,6 @@
   </w:style>
   <w:style w:type="character" w:styleId="EndnoteReference">
     <w:name w:val="endnote reference"/>
-    <w:basedOn w:val="DefaultParagraphFont"/>
     <w:uiPriority w:val="99"/>
     <w:semiHidden/>
     <w:unhideWhenUsed/>
@@ -1338,22 +2462,13 @@
   </w:style>
   <w:style w:type="paragraph" w:styleId="EndnoteText">
     <w:name w:val="endnote text"/>
-    <w:basedOn w:val="Normal"/>
     <w:link w:val="EndnoteTextChar"/>
     <w:uiPriority w:val="99"/>
     <w:semiHidden/>
     <w:unhideWhenUsed/>
-    <w:pPr>
-      <w:spacing w:after="0" w:line="240" w:lineRule="auto"/>
-    </w:pPr>
-    <w:rPr>
-      <w:sz w:val="20"/>
-      <w:szCs w:val="20"/>
-    </w:rPr>
   </w:style>
-  <w:style w:type="character" w:styleId="EndnoteTextChar">
+  <w:style w:type="character" w:customStyle="1" w:styleId="EndnoteTextChar">
     <w:name w:val="Endnote Text Char"/>
-    <w:basedOn w:val="DefaultParagraphFont"/>
     <w:link w:val="EndnoteText"/>
     <w:uiPriority w:val="99"/>
     <w:semiHidden/>
@@ -1363,82 +2478,355 @@
       <w:szCs w:val="20"/>
     </w:rPr>
   </w:style>
-  <w:style w:type="paragraph" w:styleId="Name">
+  <w:style w:type="paragraph" w:customStyle="1" w:styleId="Name">
     <w:name w:val="Name"/>
-    <w:basedOn w:val="Normal"/>
     <w:pPr>
       <w:spacing w:after="60"/>
     </w:pPr>
     <w:rPr>
-      <w:rFonts w:ascii="Calibri" w:cs="Calibri" w:eastAsia="Calibri" w:hAnsi="Calibri"/>
       <w:b/>
       <w:bCs/>
-      <w:color w:val="1a365d"/>
+      <w:color w:val="1A365D"/>
       <w:sz w:val="36"/>
       <w:szCs w:val="36"/>
     </w:rPr>
   </w:style>
-  <w:style w:type="paragraph" w:styleId="Title">
-    <w:name w:val="Title"/>
-    <w:basedOn w:val="Normal"/>
+  <w:style w:type="paragraph" w:customStyle="1" w:styleId="SectionHeader">
+    <w:name w:val="Section Header"/>
     <w:pPr>
-      <w:spacing w:after="80"/>
+      <w:pBdr>
+        <w:bottom w:val="single" w:sz="8" w:space="4" w:color="2B6CB0"/>
+      </w:pBdr>
+      <w:spacing w:before="200" w:after="80"/>
     </w:pPr>
     <w:rPr>
-      <w:rFonts w:ascii="Calibri" w:cs="Calibri" w:eastAsia="Calibri" w:hAnsi="Calibri"/>
-      <w:color w:val="2b6cb0"/>
+      <w:b/>
+      <w:bCs/>
+      <w:caps/>
+      <w:color w:val="1A365D"/>
       <w:sz w:val="22"/>
       <w:szCs w:val="22"/>
     </w:rPr>
   </w:style>
-  <w:style w:type="paragraph" w:styleId="SectionHeader">
-    <w:name w:val="Section Header"/>
-    <w:basedOn w:val="Normal"/>
+  <w:style w:type="paragraph" w:customStyle="1" w:styleId="JobTitle">
+    <w:name w:val="Job Title"/>
     <w:pPr>
-      <w:pBdr>
-        <w:bottom w:val="single" w:color="2b6cb0" w:sz="8" w:space="4"/>
-      </w:pBdr>
-      <w:spacing w:after="80" w:before="200"/>
+      <w:spacing w:before="120" w:after="20"/>
     </w:pPr>
     <w:rPr>
-      <w:rFonts w:ascii="Calibri" w:cs="Calibri" w:eastAsia="Calibri" w:hAnsi="Calibri"/>
       <w:b/>
       <w:bCs/>
-      <w:caps/>
-      <w:color w:val="1a365d"/>
-      <w:sz w:val="22"/>
-      <w:szCs w:val="22"/>
-    </w:rPr>
-  </w:style>
-  <w:style w:type="paragraph" w:styleId="JobTitle">
-    <w:name w:val="Job Title"/>
-    <w:basedOn w:val="Normal"/>
-    <w:pPr>
-      <w:spacing w:after="20" w:before="120"/>
-    </w:pPr>
-    <w:rPr>
-      <w:rFonts w:ascii="Calibri" w:cs="Calibri" w:eastAsia="Calibri" w:hAnsi="Calibri"/>
-      <w:b/>
-      <w:bCs/>
-      <w:color w:val="1a202c"/>
       <w:sz w:val="21"/>
       <w:szCs w:val="21"/>
     </w:rPr>
   </w:style>
-  <w:style w:type="paragraph" w:styleId="Company">
+  <w:style w:type="paragraph" w:customStyle="1" w:styleId="Company">
     <w:name w:val="Company"/>
-    <w:basedOn w:val="Normal"/>
     <w:pPr>
       <w:spacing w:after="40"/>
     </w:pPr>
     <w:rPr>
-      <w:rFonts w:ascii="Calibri" w:cs="Calibri" w:eastAsia="Calibri" w:hAnsi="Calibri"/>
       <w:i/>
       <w:iCs/>
-      <w:color w:val="4a5568"/>
+      <w:color w:val="4A5568"/>
       <w:sz w:val="19"/>
       <w:szCs w:val="19"/>
     </w:rPr>
   </w:style>
 </w:styles>
+</file>
+
+<file path=word/theme/theme1.xml><?xml version="1.0" encoding="utf-8"?>
+<a:theme xmlns:a="http://schemas.openxmlformats.org/drawingml/2006/main" name="Office Theme">
+  <a:themeElements>
+    <a:clrScheme name="Office">
+      <a:dk1>
+        <a:sysClr val="windowText" lastClr="000000"/>
+      </a:dk1>
+      <a:lt1>
+        <a:sysClr val="window" lastClr="FFFFFF"/>
+      </a:lt1>
+      <a:dk2>
+        <a:srgbClr val="44546A"/>
+      </a:dk2>
+      <a:lt2>
+        <a:srgbClr val="E7E6E6"/>
+      </a:lt2>
+      <a:accent1>
+        <a:srgbClr val="5B9BD5"/>
+      </a:accent1>
+      <a:accent2>
+        <a:srgbClr val="ED7D31"/>
+      </a:accent2>
+      <a:accent3>
+        <a:srgbClr val="A5A5A5"/>
+      </a:accent3>
+      <a:accent4>
+        <a:srgbClr val="FFC000"/>
+      </a:accent4>
+      <a:accent5>
+        <a:srgbClr val="4472C4"/>
+      </a:accent5>
+      <a:accent6>
+        <a:srgbClr val="70AD47"/>
+      </a:accent6>
+      <a:hlink>
+        <a:srgbClr val="0563C1"/>
+      </a:hlink>
+      <a:folHlink>
+        <a:srgbClr val="954F72"/>
+      </a:folHlink>
+    </a:clrScheme>
+    <a:fontScheme name="Office">
+      <a:majorFont>
+        <a:latin typeface="Calibri Light" panose="020F0302020204030204"/>
+        <a:ea typeface=""/>
+        <a:cs typeface=""/>
+        <a:font script="Jpan" typeface="游ゴシック Light"/>
+        <a:font script="Hang" typeface="맑은 고딕"/>
+        <a:font script="Hans" typeface="等线 Light"/>
+        <a:font script="Hant" typeface="新細明體"/>
+        <a:font script="Arab" typeface="Times New Roman"/>
+        <a:font script="Hebr" typeface="Times New Roman"/>
+        <a:font script="Thai" typeface="Angsana New"/>
+        <a:font script="Ethi" typeface="Nyala"/>
+        <a:font script="Beng" typeface="Vrinda"/>
+        <a:font script="Gujr" typeface="Shruti"/>
+        <a:font script="Khmr" typeface="MoolBoran"/>
+        <a:font script="Knda" typeface="Tunga"/>
+        <a:font script="Guru" typeface="Raavi"/>
+        <a:font script="Cans" typeface="Euphemia"/>
+        <a:font script="Cher" typeface="Plantagenet Cherokee"/>
+        <a:font script="Yiii" typeface="Microsoft Yi Baiti"/>
+        <a:font script="Tibt" typeface="Microsoft Himalaya"/>
+        <a:font script="Thaa" typeface="MV Boli"/>
+        <a:font script="Deva" typeface="Mangal"/>
+        <a:font script="Telu" typeface="Gautami"/>
+        <a:font script="Taml" typeface="Latha"/>
+        <a:font script="Syrc" typeface="Estrangelo Edessa"/>
+        <a:font script="Orya" typeface="Kalinga"/>
+        <a:font script="Mlym" typeface="Kartika"/>
+        <a:font script="Laoo" typeface="DokChampa"/>
+        <a:font script="Sinh" typeface="Iskoola Pota"/>
+        <a:font script="Mong" typeface="Mongolian Baiti"/>
+        <a:font script="Viet" typeface="Times New Roman"/>
+        <a:font script="Uigh" typeface="Microsoft Uighur"/>
+        <a:font script="Geor" typeface="Sylfaen"/>
+        <a:font script="Armn" typeface="Arial"/>
+        <a:font script="Bugi" typeface="Leelawadee UI"/>
+        <a:font script="Bopo" typeface="Microsoft JhengHei"/>
+        <a:font script="Java" typeface="Javanese Text"/>
+        <a:font script="Lisu" typeface="Segoe UI"/>
+        <a:font script="Mymr" typeface="Myanmar Text"/>
+        <a:font script="Nkoo" typeface="Ebrima"/>
+        <a:font script="Olck" typeface="Nirmala UI"/>
+        <a:font script="Osma" typeface="Ebrima"/>
+        <a:font script="Phag" typeface="Phagspa"/>
+        <a:font script="Syrn" typeface="Estrangelo Edessa"/>
+        <a:font script="Syrj" typeface="Estrangelo Edessa"/>
+        <a:font script="Syre" typeface="Estrangelo Edessa"/>
+        <a:font script="Sora" typeface="Nirmala UI"/>
+        <a:font script="Tale" typeface="Microsoft Tai Le"/>
+        <a:font script="Talu" typeface="Microsoft New Tai Lue"/>
+        <a:font script="Tfng" typeface="Ebrima"/>
+      </a:majorFont>
+      <a:minorFont>
+        <a:latin typeface="Calibri" panose="020F0502020204030204"/>
+        <a:ea typeface=""/>
+        <a:cs typeface=""/>
+        <a:font script="Jpan" typeface="游明朝"/>
+        <a:font script="Hang" typeface="맑은 고딕"/>
+        <a:font script="Hans" typeface="等线"/>
+        <a:font script="Hant" typeface="新細明體"/>
+        <a:font script="Arab" typeface="Arial"/>
+        <a:font script="Hebr" typeface="Arial"/>
+        <a:font script="Thai" typeface="Cordia New"/>
+        <a:font script="Ethi" typeface="Nyala"/>
+        <a:font script="Beng" typeface="Vrinda"/>
+        <a:font script="Gujr" typeface="Shruti"/>
+        <a:font script="Khmr" typeface="DaunPenh"/>
+        <a:font script="Knda" typeface="Tunga"/>
+        <a:font script="Guru" typeface="Raavi"/>
+        <a:font script="Cans" typeface="Euphemia"/>
+        <a:font script="Cher" typeface="Plantagenet Cherokee"/>
+        <a:font script="Yiii" typeface="Microsoft Yi Baiti"/>
+        <a:font script="Tibt" typeface="Microsoft Himalaya"/>
+        <a:font script="Thaa" typeface="MV Boli"/>
+        <a:font script="Deva" typeface="Mangal"/>
+        <a:font script="Telu" typeface="Gautami"/>
+        <a:font script="Taml" typeface="Latha"/>
+        <a:font script="Syrc" typeface="Estrangelo Edessa"/>
+        <a:font script="Orya" typeface="Kalinga"/>
+        <a:font script="Mlym" typeface="Kartika"/>
+        <a:font script="Laoo" typeface="DokChampa"/>
+        <a:font script="Sinh" typeface="Iskoola Pota"/>
+        <a:font script="Mong" typeface="Mongolian Baiti"/>
+        <a:font script="Viet" typeface="Arial"/>
+        <a:font script="Uigh" typeface="Microsoft Uighur"/>
+        <a:font script="Geor" typeface="Sylfaen"/>
+        <a:font script="Armn" typeface="Arial"/>
+        <a:font script="Bugi" typeface="Leelawadee UI"/>
+        <a:font script="Bopo" typeface="Microsoft JhengHei"/>
+        <a:font script="Java" typeface="Javanese Text"/>
+        <a:font script="Lisu" typeface="Segoe UI"/>
+        <a:font script="Mymr" typeface="Myanmar Text"/>
+        <a:font script="Nkoo" typeface="Ebrima"/>
+        <a:font script="Olck" typeface="Nirmala UI"/>
+        <a:font script="Osma" typeface="Ebrima"/>
+        <a:font script="Phag" typeface="Phagspa"/>
+        <a:font script="Syrn" typeface="Estrangelo Edessa"/>
+        <a:font script="Syrj" typeface="Estrangelo Edessa"/>
+        <a:font script="Syre" typeface="Estrangelo Edessa"/>
+        <a:font script="Sora" typeface="Nirmala UI"/>
+        <a:font script="Tale" typeface="Microsoft Tai Le"/>
+        <a:font script="Talu" typeface="Microsoft New Tai Lue"/>
+        <a:font script="Tfng" typeface="Ebrima"/>
+      </a:minorFont>
+    </a:fontScheme>
+    <a:fmtScheme name="Office">
+      <a:fillStyleLst>
+        <a:solidFill>
+          <a:schemeClr val="phClr"/>
+        </a:solidFill>
+        <a:gradFill rotWithShape="1">
+          <a:gsLst>
+            <a:gs pos="0">
+              <a:schemeClr val="phClr">
+                <a:lumMod val="110000"/>
+                <a:satMod val="105000"/>
+                <a:tint val="67000"/>
+              </a:schemeClr>
+            </a:gs>
+            <a:gs pos="50000">
+              <a:schemeClr val="phClr">
+                <a:lumMod val="105000"/>
+                <a:satMod val="103000"/>
+                <a:tint val="73000"/>
+              </a:schemeClr>
+            </a:gs>
+            <a:gs pos="100000">
+              <a:schemeClr val="phClr">
+                <a:lumMod val="105000"/>
+                <a:satMod val="109000"/>
+                <a:tint val="81000"/>
+              </a:schemeClr>
+            </a:gs>
+          </a:gsLst>
+          <a:lin ang="5400000" scaled="0"/>
+        </a:gradFill>
+        <a:gradFill rotWithShape="1">
+          <a:gsLst>
+            <a:gs pos="0">
+              <a:schemeClr val="phClr">
+                <a:satMod val="103000"/>
+                <a:lumMod val="102000"/>
+                <a:tint val="94000"/>
+              </a:schemeClr>
+            </a:gs>
+            <a:gs pos="50000">
+              <a:schemeClr val="phClr">
+                <a:satMod val="110000"/>
+                <a:lumMod val="100000"/>
+                <a:shade val="100000"/>
+              </a:schemeClr>
+            </a:gs>
+            <a:gs pos="100000">
+              <a:schemeClr val="phClr">
+                <a:lumMod val="99000"/>
+                <a:satMod val="120000"/>
+                <a:shade val="78000"/>
+              </a:schemeClr>
+            </a:gs>
+          </a:gsLst>
+          <a:lin ang="5400000" scaled="0"/>
+        </a:gradFill>
+      </a:fillStyleLst>
+      <a:lnStyleLst>
+        <a:ln w="6350" cap="flat" cmpd="sng" algn="ctr">
+          <a:solidFill>
+            <a:schemeClr val="phClr"/>
+          </a:solidFill>
+          <a:prstDash val="solid"/>
+          <a:miter lim="800000"/>
+        </a:ln>
+        <a:ln w="12700" cap="flat" cmpd="sng" algn="ctr">
+          <a:solidFill>
+            <a:schemeClr val="phClr"/>
+          </a:solidFill>
+          <a:prstDash val="solid"/>
+          <a:miter lim="800000"/>
+        </a:ln>
+        <a:ln w="19050" cap="flat" cmpd="sng" algn="ctr">
+          <a:solidFill>
+            <a:schemeClr val="phClr"/>
+          </a:solidFill>
+          <a:prstDash val="solid"/>
+          <a:miter lim="800000"/>
+        </a:ln>
+      </a:lnStyleLst>
+      <a:effectStyleLst>
+        <a:effectStyle>
+          <a:effectLst/>
+        </a:effectStyle>
+        <a:effectStyle>
+          <a:effectLst/>
+        </a:effectStyle>
+        <a:effectStyle>
+          <a:effectLst>
+            <a:outerShdw blurRad="57150" dist="19050" dir="5400000" algn="ctr" rotWithShape="0">
+              <a:srgbClr val="000000">
+                <a:alpha val="63000"/>
+              </a:srgbClr>
+            </a:outerShdw>
+          </a:effectLst>
+        </a:effectStyle>
+      </a:effectStyleLst>
+      <a:bgFillStyleLst>
+        <a:solidFill>
+          <a:schemeClr val="phClr"/>
+        </a:solidFill>
+        <a:solidFill>
+          <a:schemeClr val="phClr">
+            <a:tint val="95000"/>
+            <a:satMod val="170000"/>
+          </a:schemeClr>
+        </a:solidFill>
+        <a:gradFill rotWithShape="1">
+          <a:gsLst>
+            <a:gs pos="0">
+              <a:schemeClr val="phClr">
+                <a:tint val="93000"/>
+                <a:satMod val="150000"/>
+                <a:shade val="98000"/>
+                <a:lumMod val="102000"/>
+              </a:schemeClr>
+            </a:gs>
+            <a:gs pos="50000">
+              <a:schemeClr val="phClr">
+                <a:tint val="98000"/>
+                <a:satMod val="130000"/>
+                <a:shade val="90000"/>
+                <a:lumMod val="103000"/>
+              </a:schemeClr>
+            </a:gs>
+            <a:gs pos="100000">
+              <a:schemeClr val="phClr">
+                <a:shade val="63000"/>
+                <a:satMod val="120000"/>
+              </a:schemeClr>
+            </a:gs>
+          </a:gsLst>
+          <a:lin ang="5400000" scaled="0"/>
+        </a:gradFill>
+      </a:bgFillStyleLst>
+    </a:fmtScheme>
+  </a:themeElements>
+  <a:objectDefaults/>
+  <a:extraClrSchemeLst/>
+  <a:extLst>
+    <a:ext uri="{05A4C25C-085E-4340-85A3-A5531E510DB2}">
+      <thm15:themeFamily xmlns:thm15="http://schemas.microsoft.com/office/thememl/2012/main" name="Office Theme" id="{62F939B6-93AF-4DB8-9C6B-D6C7DFDC589F}" vid="{4A3C46E8-61CC-4603-A589-7422A47A8E4A}"/>
+    </a:ext>
+  </a:extLst>
+</a:theme>
 </file>
</xml_diff>